<commit_message>
Complete and polish E-PU10 V2 SDD based on ePU10_TC4024-Development PLC project
</commit_message>
<xml_diff>
--- a/HADI/E-PU10_V2_SDD_Template.docx
+++ b/HADI/E-PU10_V2_SDD_Template.docx
@@ -298,21 +298,8 @@
           <w:numId w:val="12"/>
         </w:numPr>
       </w:pPr>
-      <w:proofErr w:type="spellStart"/>
-      <w:r>
-        <w:t>ACSwitchgear</w:t>
-      </w:r>
-      <w:proofErr w:type="spellEnd"/>
-      <w:r>
-        <w:t xml:space="preserve"> (</w:t>
-      </w:r>
-      <w:proofErr w:type="spellStart"/>
-      <w:r>
-        <w:t>clientbox</w:t>
-      </w:r>
-      <w:proofErr w:type="spellEnd"/>
-      <w:r>
-        <w:t>)</w:t>
+      <w:r>
+        <w:t xml:space="preserve">ACDCCharger</w:t>
       </w:r>
     </w:p>
     <w:p>
@@ -323,8 +310,21 @@
           <w:numId w:val="12"/>
         </w:numPr>
       </w:pPr>
-      <w:r>
-        <w:t>BMS</w:t>
+      <w:proofErr w:type="spellStart"/>
+      <w:r>
+        <w:t>ACSwitchgear</w:t>
+      </w:r>
+      <w:proofErr w:type="spellEnd"/>
+      <w:r>
+        <w:t xml:space="preserve"> (</w:t>
+      </w:r>
+      <w:proofErr w:type="spellStart"/>
+      <w:r>
+        <w:t>clientbox</w:t>
+      </w:r>
+      <w:proofErr w:type="spellEnd"/>
+      <w:r>
+        <w:t>)</w:t>
       </w:r>
     </w:p>
     <w:p>
@@ -335,11 +335,9 @@
           <w:numId w:val="12"/>
         </w:numPr>
       </w:pPr>
-      <w:proofErr w:type="spellStart"/>
-      <w:r>
-        <w:t>CoolingSystem</w:t>
-      </w:r>
-      <w:proofErr w:type="spellEnd"/>
+      <w:r>
+        <w:t>BMS</w:t>
+      </w:r>
     </w:p>
     <w:p>
       <w:pPr>
@@ -351,7 +349,7 @@
       </w:pPr>
       <w:proofErr w:type="spellStart"/>
       <w:r>
-        <w:t>DCSwitchgear</w:t>
+        <w:t>CoolingSystem</w:t>
       </w:r>
       <w:proofErr w:type="spellEnd"/>
     </w:p>
@@ -363,9 +361,11 @@
           <w:numId w:val="12"/>
         </w:numPr>
       </w:pPr>
-      <w:r>
-        <w:t>Enclosure</w:t>
-      </w:r>
+      <w:proofErr w:type="spellStart"/>
+      <w:r>
+        <w:t>DCSwitchgear</w:t>
+      </w:r>
+      <w:proofErr w:type="spellEnd"/>
     </w:p>
     <w:p>
       <w:pPr>
@@ -375,20 +375,9 @@
           <w:numId w:val="12"/>
         </w:numPr>
       </w:pPr>
-      <w:proofErr w:type="spellStart"/>
-      <w:r>
-        <w:lastRenderedPageBreak/>
-        <w:t>GenComm</w:t>
-      </w:r>
-      <w:proofErr w:type="spellEnd"/>
-      <w:r>
-        <w:br/>
-      </w:r>
-      <w:proofErr w:type="spellStart"/>
-      <w:r>
-        <w:t>HartingIO</w:t>
-      </w:r>
-      <w:proofErr w:type="spellEnd"/>
+      <w:r>
+        <w:t>Enclosure</w:t>
+      </w:r>
     </w:p>
     <w:p>
       <w:pPr>
@@ -400,7 +389,16 @@
       </w:pPr>
       <w:proofErr w:type="spellStart"/>
       <w:r>
-        <w:t>InterMachineCom</w:t>
+        <w:lastRenderedPageBreak/>
+        <w:t>GenComm</w:t>
+      </w:r>
+      <w:proofErr w:type="spellEnd"/>
+      <w:r>
+        <w:br/>
+      </w:r>
+      <w:proofErr w:type="spellStart"/>
+      <w:r>
+        <w:t>HartingIO</w:t>
       </w:r>
       <w:proofErr w:type="spellEnd"/>
     </w:p>
@@ -414,7 +412,7 @@
       </w:pPr>
       <w:proofErr w:type="spellStart"/>
       <w:r>
-        <w:t>InternalPowerSupply</w:t>
+        <w:t>InterMachineCom</w:t>
       </w:r>
       <w:proofErr w:type="spellEnd"/>
     </w:p>
@@ -428,7 +426,7 @@
       </w:pPr>
       <w:proofErr w:type="spellStart"/>
       <w:r>
-        <w:t>NeutralTransformer</w:t>
+        <w:t>InternalPowerSupply</w:t>
       </w:r>
       <w:proofErr w:type="spellEnd"/>
     </w:p>
@@ -442,7 +440,7 @@
       </w:pPr>
       <w:proofErr w:type="spellStart"/>
       <w:r>
-        <w:t>PeakshaveBox</w:t>
+        <w:t>NeutralTransformer</w:t>
       </w:r>
       <w:proofErr w:type="spellEnd"/>
     </w:p>
@@ -456,7 +454,7 @@
       </w:pPr>
       <w:proofErr w:type="spellStart"/>
       <w:r>
-        <w:t>PLCStatus</w:t>
+        <w:t>PeakshaveBox</w:t>
       </w:r>
       <w:proofErr w:type="spellEnd"/>
     </w:p>
@@ -470,7 +468,7 @@
       </w:pPr>
       <w:proofErr w:type="spellStart"/>
       <w:r>
-        <w:t>PowerQualityMonitor</w:t>
+        <w:t>PLCStatus</w:t>
       </w:r>
       <w:proofErr w:type="spellEnd"/>
     </w:p>
@@ -484,7 +482,7 @@
       </w:pPr>
       <w:proofErr w:type="spellStart"/>
       <w:r>
-        <w:t>PowerStack</w:t>
+        <w:t>PowerQualityMonitor</w:t>
       </w:r>
       <w:proofErr w:type="spellEnd"/>
     </w:p>
@@ -498,7 +496,7 @@
       </w:pPr>
       <w:proofErr w:type="spellStart"/>
       <w:r>
-        <w:t>ProtectionSystems</w:t>
+        <w:t>PowerStack</w:t>
       </w:r>
       <w:proofErr w:type="spellEnd"/>
     </w:p>
@@ -512,6 +510,20 @@
       </w:pPr>
       <w:proofErr w:type="spellStart"/>
       <w:r>
+        <w:t>ProtectionSystems</w:t>
+      </w:r>
+      <w:proofErr w:type="spellEnd"/>
+    </w:p>
+    <w:p>
+      <w:pPr>
+        <w:pStyle w:val="ListParagraph"/>
+        <w:numPr>
+          <w:ilvl w:val="2"/>
+          <w:numId w:val="12"/>
+        </w:numPr>
+      </w:pPr>
+      <w:proofErr w:type="spellStart"/>
+      <w:r>
         <w:t>WearLogging</w:t>
       </w:r>
       <w:proofErr w:type="spellEnd"/>
@@ -582,7 +594,7 @@
       </w:r>
       <w:proofErr w:type="spellEnd"/>
       <w:r>
-        <w:t xml:space="preserve"> (1ms)</w:t>
+        <w:t xml:space="preserve"> (2 ms)</w:t>
       </w:r>
       <w:r>
         <w:t xml:space="preserve"> (PRG)</w:t>
@@ -626,16 +638,11 @@
       </w:r>
     </w:p>
     <w:p>
-      <w:r>
-        <w:t xml:space="preserve">• </w:t>
-      </w:r>
-      <w:proofErr w:type="spellStart"/>
-      <w:r>
-        <w:t>ErrorHandling</w:t>
-      </w:r>
-      <w:proofErr w:type="spellEnd"/>
-      <w:r>
-        <w:t>: Centralized fault detection and handling.</w:t>
+      <w:pPr>
+        <w:pStyle w:val="Normal"/>
+      </w:pPr>
+      <w:r>
+        <w:t xml:space="preserve">• ControlManager: Top-level supervisory program coordinating monitoring, external interfaces and persistent settings.</w:t>
       </w:r>
     </w:p>
     <w:p>
@@ -647,7 +654,7 @@
         </w:numPr>
       </w:pPr>
       <w:r>
-        <w:t xml:space="preserve">Error acknowledge </w:t>
+        <w:t xml:space="preserve">Calls the HMI, ProfinetController, IoT and TestScripts sub-modules each slow cycle.</w:t>
       </w:r>
     </w:p>
     <w:p>
@@ -659,35 +666,7 @@
         </w:numPr>
       </w:pPr>
       <w:r>
-        <w:t>Type of error (Error, Fault, Warning)</w:t>
-      </w:r>
-    </w:p>
-    <w:p>
-      <w:pPr>
-        <w:pStyle w:val="ListParagraph"/>
-      </w:pPr>
-    </w:p>
-    <w:p>
-      <w:r>
-        <w:t>•</w:t>
-      </w:r>
-      <w:r>
-        <w:t xml:space="preserve"> EventLogger: Records events, state changes and user actions.</w:t>
-      </w:r>
-    </w:p>
-    <w:p>
-      <w:r>
-        <w:t>• MonitoringControl: Supervisory control, HMI interaction and monitoring.</w:t>
-      </w:r>
-    </w:p>
-    <w:p>
-      <w:r>
-        <w:t>• ControlManager: Coordinates operating modes and system state transitions.</w:t>
-      </w:r>
-    </w:p>
-    <w:p>
-      <w:r>
-        <w:t>• BMS: Battery Management System communication and supervision.</w:t>
+        <w:t xml:space="preserve">Selects the active control source (HMI, PROFINET or IoT) and forwards the corresponding setpoints to the system.</w:t>
       </w:r>
     </w:p>
     <w:p>
@@ -695,11 +674,24 @@
         <w:pStyle w:val="ListParagraph"/>
         <w:numPr>
           <w:ilvl w:val="0"/>
-          <w:numId w:val="14"/>
+          <w:numId w:val="13"/>
         </w:numPr>
       </w:pPr>
       <w:r>
-        <w:t>Define Max and Min Charge / Discharge</w:t>
+        <w:t xml:space="preserve">Manages write-back of persistent settings (hard/soft) via the TwinCAT persistent-data service.</w:t>
+      </w:r>
+    </w:p>
+    <w:p>
+      <w:pPr>
+        <w:pStyle w:val="Normal"/>
+      </w:pPr>
+    </w:p>
+    <w:p>
+      <w:pPr>
+        <w:pStyle w:val="Normal"/>
+      </w:pPr>
+      <w:r>
+        <w:t xml:space="preserve">• MonitoringControl: Container for the supervisory sub-modules used by the slow task.</w:t>
       </w:r>
     </w:p>
     <w:p>
@@ -707,97 +699,1196 @@
         <w:pStyle w:val="ListParagraph"/>
         <w:numPr>
           <w:ilvl w:val="0"/>
-          <w:numId w:val="14"/>
+          <w:numId w:val="13"/>
         </w:numPr>
       </w:pPr>
       <w:r>
-        <w:t xml:space="preserve">Handles communication to the BMS system via </w:t>
-      </w:r>
-      <w:proofErr w:type="spellStart"/>
-      <w:r>
-        <w:t>ModbusTCP</w:t>
-      </w:r>
-      <w:proofErr w:type="spellEnd"/>
-      <w:r>
-        <w:t xml:space="preserve"> and exchanges system data.</w:t>
-      </w:r>
-    </w:p>
-    <w:p>
-      <w:r>
-        <w:t>•</w:t>
-      </w:r>
-      <w:r>
-        <w:t xml:space="preserve"> PowerStack: PCS/Power Converter interface and power control.</w:t>
-      </w:r>
-    </w:p>
-    <w:p>
-      <w:r>
-        <w:t>• PeakshaveBox: Peak shaving and energy management functions.</w:t>
-      </w:r>
-    </w:p>
-    <w:p>
-      <w:r>
-        <w:t>• ProtectionSystems: Protection relay monitoring and trip management.</w:t>
-      </w:r>
-    </w:p>
-    <w:p>
-      <w:r>
-        <w:t xml:space="preserve">• </w:t>
-      </w:r>
-      <w:proofErr w:type="spellStart"/>
-      <w:r>
-        <w:t>GenComm</w:t>
-      </w:r>
-      <w:proofErr w:type="spellEnd"/>
-      <w:r>
-        <w:t>: External communication services</w:t>
-      </w:r>
-      <w:r>
-        <w:t xml:space="preserve"> (</w:t>
-      </w:r>
-      <w:proofErr w:type="spellStart"/>
-      <w:r>
-        <w:t>Geneset</w:t>
-      </w:r>
-      <w:proofErr w:type="spellEnd"/>
-      <w:r>
-        <w:t>)</w:t>
-      </w:r>
-      <w:r>
-        <w:t>.</w:t>
-      </w:r>
-    </w:p>
-    <w:p>
-      <w:r>
-        <w:lastRenderedPageBreak/>
-        <w:t>• InterMachineCom: Communication with external equipment/controllers</w:t>
-      </w:r>
-      <w:r>
-        <w:t xml:space="preserve"> (MQTT)</w:t>
-      </w:r>
-      <w:r>
-        <w:t>.</w:t>
-      </w:r>
-    </w:p>
-    <w:p>
-      <w:r>
-        <w:t>• PLCStatus: Internal PLC diagnostics and health monitoring.</w:t>
-      </w:r>
-    </w:p>
-    <w:p>
-      <w:r>
-        <w:t>• Safety: Safety logic and emergency shutdown functions.</w:t>
-      </w:r>
-    </w:p>
-    <w:p>
-      <w:r>
-        <w:t>• PowerControl: Charge/discharge control algorithms.</w:t>
-      </w:r>
-    </w:p>
-    <w:p>
-      <w:r>
-        <w:t>• GenGridControl: Grid interaction and dispatch logic.</w:t>
-      </w:r>
+        <w:t xml:space="preserve">Aggregates the HMI, IoT and ProfinetController function blocks.</w:t>
+      </w:r>
+    </w:p>
+    <w:p>
+      <w:pPr>
+        <w:pStyle w:val="ListParagraph"/>
+        <w:numPr>
+          <w:ilvl w:val="0"/>
+          <w:numId w:val="13"/>
+        </w:numPr>
+      </w:pPr>
+      <w:r>
+        <w:t xml:space="preserve">Provides the common monitoring/control structures (ST_System_Monitor / ST_System_Control) exchanged with the fast task.</w:t>
+      </w:r>
+    </w:p>
+    <w:p>
+      <w:pPr>
+        <w:pStyle w:val="Normal"/>
+      </w:pPr>
+    </w:p>
+    <w:p>
+      <w:pPr>
+        <w:pStyle w:val="Normal"/>
+      </w:pPr>
+      <w:r>
+        <w:t xml:space="preserve">• ErrorHandling: Centralized fault detection, classification and acknowledgement.</w:t>
+      </w:r>
+    </w:p>
+    <w:p>
+      <w:pPr>
+        <w:pStyle w:val="ListParagraph"/>
+        <w:numPr>
+          <w:ilvl w:val="0"/>
+          <w:numId w:val="13"/>
+        </w:numPr>
+      </w:pPr>
+      <w:r>
+        <w:t xml:space="preserve">Collects errors raised by every object FB through a common FB_AddErrorST interface.</w:t>
+      </w:r>
+    </w:p>
+    <w:p>
+      <w:pPr>
+        <w:pStyle w:val="ListParagraph"/>
+        <w:numPr>
+          <w:ilvl w:val="0"/>
+          <w:numId w:val="13"/>
+        </w:numPr>
+      </w:pPr>
+      <w:r>
+        <w:t xml:space="preserve">Classifies events as Warning, Error or Fault and drives the corresponding global shutdown flags.</w:t>
+      </w:r>
+    </w:p>
+    <w:p>
+      <w:pPr>
+        <w:pStyle w:val="ListParagraph"/>
+        <w:numPr>
+          <w:ilvl w:val="0"/>
+          <w:numId w:val="13"/>
+        </w:numPr>
+      </w:pPr>
+      <w:r>
+        <w:t xml:space="preserve">Supports user acknowledgement and history clearing from HMI and remote interfaces.</w:t>
+      </w:r>
+    </w:p>
+    <w:p>
+      <w:pPr>
+        <w:pStyle w:val="Normal"/>
+      </w:pPr>
+    </w:p>
+    <w:p>
+      <w:pPr>
+        <w:pStyle w:val="Normal"/>
+      </w:pPr>
+      <w:r>
+        <w:t xml:space="preserve">• EventLogger: Records events, state changes and user actions for later analysis.</w:t>
+      </w:r>
+    </w:p>
+    <w:p>
+      <w:pPr>
+        <w:pStyle w:val="ListParagraph"/>
+        <w:numPr>
+          <w:ilvl w:val="0"/>
+          <w:numId w:val="13"/>
+        </w:numPr>
+      </w:pPr>
+      <w:r>
+        <w:t xml:space="preserve">Provides the WriteLogItem function used by all modules to push entries with source, severity and text.</w:t>
+      </w:r>
+    </w:p>
+    <w:p>
+      <w:pPr>
+        <w:pStyle w:val="ListParagraph"/>
+        <w:numPr>
+          <w:ilvl w:val="0"/>
+          <w:numId w:val="13"/>
+        </w:numPr>
+      </w:pPr>
+      <w:r>
+        <w:t xml:space="preserve">Persists log items to file storage using TwinCAT file I/O function blocks.</w:t>
+      </w:r>
+    </w:p>
+    <w:p>
+      <w:pPr>
+        <w:pStyle w:val="Normal"/>
+      </w:pPr>
+    </w:p>
+    <w:p>
+      <w:pPr>
+        <w:pStyle w:val="Normal"/>
+      </w:pPr>
+      <w:r>
+        <w:t xml:space="preserve">• Datalogger: Periodic acquisition and historisation of monitoring data.</w:t>
+      </w:r>
+    </w:p>
+    <w:p>
+      <w:pPr>
+        <w:pStyle w:val="ListParagraph"/>
+        <w:numPr>
+          <w:ilvl w:val="0"/>
+          <w:numId w:val="13"/>
+        </w:numPr>
+      </w:pPr>
+      <w:r>
+        <w:t xml:space="preserve">Samples the ST_System_Monitor structure at a configurable rate.</w:t>
+      </w:r>
+    </w:p>
+    <w:p>
+      <w:pPr>
+        <w:pStyle w:val="ListParagraph"/>
+        <w:numPr>
+          <w:ilvl w:val="0"/>
+          <w:numId w:val="13"/>
+        </w:numPr>
+      </w:pPr>
+      <w:r>
+        <w:t xml:space="preserve">Provides array-based buffers used by the HMI trend screens and exported historic files.</w:t>
+      </w:r>
+    </w:p>
+    <w:p>
+      <w:pPr>
+        <w:pStyle w:val="Normal"/>
+      </w:pPr>
+    </w:p>
+    <w:p>
+      <w:pPr>
+        <w:pStyle w:val="Normal"/>
+      </w:pPr>
+      <w:r>
+        <w:t xml:space="preserve">• WearLogging: Persistent tracking of wear-related variables across power cycles.</w:t>
+      </w:r>
+    </w:p>
+    <w:p>
+      <w:pPr>
+        <w:pStyle w:val="ListParagraph"/>
+        <w:numPr>
+          <w:ilvl w:val="0"/>
+          <w:numId w:val="13"/>
+        </w:numPr>
+      </w:pPr>
+      <w:r>
+        <w:t xml:space="preserve">Generic FB_VarLogger supports on-time tracking, edge counting and min/max recording per item.</w:t>
+      </w:r>
+    </w:p>
+    <w:p>
+      <w:pPr>
+        <w:pStyle w:val="ListParagraph"/>
+        <w:numPr>
+          <w:ilvl w:val="0"/>
+          <w:numId w:val="13"/>
+        </w:numPr>
+      </w:pPr>
+      <w:r>
+        <w:t xml:space="preserve">Used by Safety, Power Stack, BMS and other modules to expose lifetime counters and statistics.</w:t>
+      </w:r>
+    </w:p>
+    <w:p>
+      <w:pPr>
+        <w:pStyle w:val="Normal"/>
+      </w:pPr>
+    </w:p>
+    <w:p>
+      <w:pPr>
+        <w:pStyle w:val="Normal"/>
+      </w:pPr>
+      <w:r>
+        <w:t xml:space="preserve">• HMI: TwinCAT 3 HMI server interface for the local touch panel.</w:t>
+      </w:r>
+    </w:p>
+    <w:p>
+      <w:pPr>
+        <w:pStyle w:val="ListParagraph"/>
+        <w:numPr>
+          <w:ilvl w:val="0"/>
+          <w:numId w:val="13"/>
+        </w:numPr>
+      </w:pPr>
+      <w:r>
+        <w:t xml:space="preserve">Exposes monitoring data and operator commands through the ST_HMI_monitor and ST_HMI_control structures.</w:t>
+      </w:r>
+    </w:p>
+    <w:p>
+      <w:pPr>
+        <w:pStyle w:val="ListParagraph"/>
+        <w:numPr>
+          <w:ilvl w:val="0"/>
+          <w:numId w:val="13"/>
+        </w:numPr>
+      </w:pPr>
+      <w:r>
+        <w:t xml:space="preserve">Implements the screen navigation logic (Overview, Operation Controls, Machine Status, Settings, Diagnostics, Historics).</w:t>
+      </w:r>
+    </w:p>
+    <w:p>
+      <w:pPr>
+        <w:pStyle w:val="ListParagraph"/>
+        <w:numPr>
+          <w:ilvl w:val="0"/>
+          <w:numId w:val="13"/>
+        </w:numPr>
+      </w:pPr>
+      <w:r>
+        <w:t xml:space="preserve">Provides user-level access management and forwards parameter changes to the persistent settings store.</w:t>
+      </w:r>
+    </w:p>
+    <w:p>
+      <w:pPr>
+        <w:pStyle w:val="Normal"/>
+      </w:pPr>
+    </w:p>
+    <w:p>
+      <w:pPr>
+        <w:pStyle w:val="Normal"/>
+      </w:pPr>
+      <w:r>
+        <w:t xml:space="preserve">• IoT: Remote telemetry and command interface based on MQTT.</w:t>
+      </w:r>
+    </w:p>
+    <w:p>
+      <w:pPr>
+        <w:pStyle w:val="ListParagraph"/>
+        <w:numPr>
+          <w:ilvl w:val="0"/>
+          <w:numId w:val="13"/>
+        </w:numPr>
+      </w:pPr>
+      <w:r>
+        <w:t xml:space="preserve">Connects to the OpenRemote broker using the TwinCAT FB_IotMqttClient (secured connection).</w:t>
+      </w:r>
+    </w:p>
+    <w:p>
+      <w:pPr>
+        <w:pStyle w:val="ListParagraph"/>
+        <w:numPr>
+          <w:ilvl w:val="0"/>
+          <w:numId w:val="13"/>
+        </w:numPr>
+      </w:pPr>
+      <w:r>
+        <w:t xml:space="preserve">Publishes system status, active events and KPIs; subscribes to remote commands such as shutdown requests.</w:t>
+      </w:r>
+    </w:p>
+    <w:p>
+      <w:pPr>
+        <w:pStyle w:val="ListParagraph"/>
+        <w:numPr>
+          <w:ilvl w:val="0"/>
+          <w:numId w:val="13"/>
+        </w:numPr>
+      </w:pPr>
+      <w:r>
+        <w:t xml:space="preserve">Connection state and last-error information are surfaced through ST_ExtController_get.</w:t>
+      </w:r>
+    </w:p>
+    <w:p>
+      <w:pPr>
+        <w:pStyle w:val="Normal"/>
+      </w:pPr>
+    </w:p>
+    <w:p>
+      <w:pPr>
+        <w:pStyle w:val="Normal"/>
+      </w:pPr>
+      <w:r>
+        <w:t xml:space="preserve">• ProfinetController: External controller interface over PROFINET.</w:t>
+      </w:r>
+    </w:p>
+    <w:p>
+      <w:pPr>
+        <w:pStyle w:val="ListParagraph"/>
+        <w:numPr>
+          <w:ilvl w:val="0"/>
+          <w:numId w:val="13"/>
+        </w:numPr>
+      </w:pPr>
+      <w:r>
+        <w:t xml:space="preserve">Exchanges setpoints and feedback with an upstream EMS/SCADA PLC when an EL669x PROFINET coupler is fitted.</w:t>
+      </w:r>
+    </w:p>
+    <w:p>
+      <w:pPr>
+        <w:pStyle w:val="ListParagraph"/>
+        <w:numPr>
+          <w:ilvl w:val="0"/>
+          <w:numId w:val="13"/>
+        </w:numPr>
+      </w:pPr>
+      <w:r>
+        <w:t xml:space="preserve">Coupler type and availability are taken from the Configuration settings.</w:t>
+      </w:r>
+    </w:p>
+    <w:p>
+      <w:pPr>
+        <w:pStyle w:val="ListParagraph"/>
+        <w:numPr>
+          <w:ilvl w:val="0"/>
+          <w:numId w:val="13"/>
+        </w:numPr>
+      </w:pPr>
+      <w:r>
+        <w:t xml:space="preserve">Activates only when the operator selects PROFINET as the control source in ControlManager.</w:t>
+      </w:r>
+    </w:p>
+    <w:p>
+      <w:pPr>
+        <w:pStyle w:val="Normal"/>
+      </w:pPr>
+    </w:p>
+    <w:p>
+      <w:pPr>
+        <w:pStyle w:val="Normal"/>
+      </w:pPr>
+      <w:r>
+        <w:t xml:space="preserve">• InterMachineCom: MQTT-based communication between parallel-operating units.</w:t>
+      </w:r>
+    </w:p>
+    <w:p>
+      <w:pPr>
+        <w:pStyle w:val="ListParagraph"/>
+        <w:numPr>
+          <w:ilvl w:val="0"/>
+          <w:numId w:val="13"/>
+        </w:numPr>
+      </w:pPr>
+      <w:r>
+        <w:t xml:space="preserve">Implements master/slave roles via FB_ConnectMqttBroker and ST_InterMachineCom_Master / Slave structures.</w:t>
+      </w:r>
+    </w:p>
+    <w:p>
+      <w:pPr>
+        <w:pStyle w:val="ListParagraph"/>
+        <w:numPr>
+          <w:ilvl w:val="0"/>
+          <w:numId w:val="13"/>
+        </w:numPr>
+      </w:pPr>
+      <w:r>
+        <w:t xml:space="preserve">Used when several E-PU10 units are coupled for output parallel operation.</w:t>
+      </w:r>
+    </w:p>
+    <w:p>
+      <w:pPr>
+        <w:pStyle w:val="Normal"/>
+      </w:pPr>
+    </w:p>
+    <w:p>
+      <w:pPr>
+        <w:pStyle w:val="Normal"/>
+      </w:pPr>
+      <w:r>
+        <w:t xml:space="preserve">• PowerControl: Real-time charge/discharge power control algorithms.</w:t>
+      </w:r>
+    </w:p>
+    <w:p>
+      <w:pPr>
+        <w:pStyle w:val="ListParagraph"/>
+        <w:numPr>
+          <w:ilvl w:val="0"/>
+          <w:numId w:val="13"/>
+        </w:numPr>
+      </w:pPr>
+      <w:r>
+        <w:t xml:space="preserve">Computes active and reactive power requests for the inverter from the active operating mode (P/Q, PF, droop, isochronous).</w:t>
+      </w:r>
+    </w:p>
+    <w:p>
+      <w:pPr>
+        <w:pStyle w:val="ListParagraph"/>
+        <w:numPr>
+          <w:ilvl w:val="0"/>
+          <w:numId w:val="13"/>
+        </w:numPr>
+      </w:pPr>
+      <w:r>
+        <w:t xml:space="preserve">Applies SOC-based limits, voltage/frequency droop and Power-Stack feedback to keep the operating point within safe margins.</w:t>
+      </w:r>
+    </w:p>
+    <w:p>
+      <w:pPr>
+        <w:pStyle w:val="ListParagraph"/>
+        <w:numPr>
+          <w:ilvl w:val="0"/>
+          <w:numId w:val="13"/>
+        </w:numPr>
+      </w:pPr>
+      <w:r>
+        <w:t xml:space="preserve">Provides separate inverter and generator power requests to support hybrid (battery + genset) operation.</w:t>
+      </w:r>
+    </w:p>
+    <w:p>
+      <w:pPr>
+        <w:pStyle w:val="Normal"/>
+      </w:pPr>
+    </w:p>
+    <w:p>
+      <w:pPr>
+        <w:pStyle w:val="Normal"/>
+      </w:pPr>
+      <w:r>
+        <w:t xml:space="preserve">• GenGridControl: Supervisory grid- and genset-interaction logic.</w:t>
+      </w:r>
+    </w:p>
+    <w:p>
+      <w:pPr>
+        <w:pStyle w:val="ListParagraph"/>
+        <w:numPr>
+          <w:ilvl w:val="0"/>
+          <w:numId w:val="13"/>
+        </w:numPr>
+      </w:pPr>
+      <w:r>
+        <w:t xml:space="preserve">Drives input and external contactors via FB_ContactorControl, including synchronisation through a PID-based voltage trim.</w:t>
+      </w:r>
+    </w:p>
+    <w:p>
+      <w:pPr>
+        <w:pStyle w:val="ListParagraph"/>
+        <w:numPr>
+          <w:ilvl w:val="0"/>
+          <w:numId w:val="13"/>
+        </w:numPr>
+      </w:pPr>
+      <w:r>
+        <w:t xml:space="preserve">Decides between grid-following and grid-forming behaviour based on bus presence and operator selection.</w:t>
+      </w:r>
+    </w:p>
+    <w:p>
+      <w:pPr>
+        <w:pStyle w:val="ListParagraph"/>
+        <w:numPr>
+          <w:ilvl w:val="0"/>
+          <w:numId w:val="13"/>
+        </w:numPr>
+      </w:pPr>
+      <w:r>
+        <w:t xml:space="preserve">Implements automatic start/stop on SOC, load, charge-load and full-battery criteria.</w:t>
+      </w:r>
+    </w:p>
+    <w:p>
+      <w:pPr>
+        <w:pStyle w:val="ListParagraph"/>
+        <w:numPr>
+          <w:ilvl w:val="0"/>
+          <w:numId w:val="13"/>
+        </w:numPr>
+      </w:pPr>
+      <w:r>
+        <w:t xml:space="preserve">Provides the target structure consumed by PowerControl.</w:t>
+      </w:r>
+    </w:p>
+    <w:p>
+      <w:pPr>
+        <w:pStyle w:val="Normal"/>
+      </w:pPr>
+    </w:p>
+    <w:p>
+      <w:pPr>
+        <w:pStyle w:val="Normal"/>
+      </w:pPr>
+      <w:r>
+        <w:t xml:space="preserve">• Safety: TwinSAFE supervisory program and EDM signal handling.</w:t>
+      </w:r>
+    </w:p>
+    <w:p>
+      <w:pPr>
+        <w:pStyle w:val="ListParagraph"/>
+        <w:numPr>
+          <w:ilvl w:val="0"/>
+          <w:numId w:val="13"/>
+        </w:numPr>
+      </w:pPr>
+      <w:r>
+        <w:t xml:space="preserve">Runs under a dedicated safety task and interfaces with the TwinSAFE I/O via ST_Safety_ToSafetyPrg / ST_Safety_get.</w:t>
+      </w:r>
+    </w:p>
+    <w:p>
+      <w:pPr>
+        <w:pStyle w:val="ListParagraph"/>
+        <w:numPr>
+          <w:ilvl w:val="0"/>
+          <w:numId w:val="13"/>
+        </w:numPr>
+      </w:pPr>
+      <w:r>
+        <w:t xml:space="preserve">Monitors the external emergency-stop input, manual reset, and contactor EDM feedbacks of the net contactor and master/slave MCCBs.</w:t>
+      </w:r>
+    </w:p>
+    <w:p>
+      <w:pPr>
+        <w:pStyle w:val="ListParagraph"/>
+        <w:numPr>
+          <w:ilvl w:val="0"/>
+          <w:numId w:val="13"/>
+        </w:numPr>
+      </w:pPr>
+      <w:r>
+        <w:t xml:space="preserve">Records E-Stop activations and power-module door openings through FB_VarLogger for lifetime statistics.</w:t>
+      </w:r>
+    </w:p>
+    <w:p>
+      <w:pPr>
+        <w:pStyle w:val="ListParagraph"/>
+        <w:numPr>
+          <w:ilvl w:val="0"/>
+          <w:numId w:val="13"/>
+        </w:numPr>
+      </w:pPr>
+      <w:r>
+        <w:t xml:space="preserve">Drives the global emergency-shutdown flag used by the rest of the application.</w:t>
+      </w:r>
+    </w:p>
+    <w:p>
+      <w:pPr>
+        <w:pStyle w:val="Normal"/>
+      </w:pPr>
+    </w:p>
+    <w:p>
+      <w:pPr>
+        <w:pStyle w:val="Normal"/>
+      </w:pPr>
+      <w:r>
+        <w:t xml:space="preserve">• BMS: Battery Management System communication and supervision.</w:t>
+      </w:r>
+    </w:p>
+    <w:p>
+      <w:pPr>
+        <w:pStyle w:val="ListParagraph"/>
+        <w:numPr>
+          <w:ilvl w:val="0"/>
+          <w:numId w:val="13"/>
+        </w:numPr>
+      </w:pPr>
+      <w:r>
+        <w:t xml:space="preserve">Wraps the MBMU/SBMU data exchange and exposes a consolidated battery summary (voltage, current, SOC, SOH, temperatures).</w:t>
+      </w:r>
+    </w:p>
+    <w:p>
+      <w:pPr>
+        <w:pStyle w:val="ListParagraph"/>
+        <w:numPr>
+          <w:ilvl w:val="0"/>
+          <w:numId w:val="13"/>
+        </w:numPr>
+      </w:pPr>
+      <w:r>
+        <w:t xml:space="preserve">Translates BMS status words into harmonised warnings and faults (communication loss, configuration warning, HV interlock, …).</w:t>
+      </w:r>
+    </w:p>
+    <w:p>
+      <w:pPr>
+        <w:pStyle w:val="ListParagraph"/>
+        <w:numPr>
+          <w:ilvl w:val="0"/>
+          <w:numId w:val="13"/>
+        </w:numPr>
+      </w:pPr>
+      <w:r>
+        <w:t xml:space="preserve">Maintains persistent battery statistics: cycle count, cumulative charge/discharge energy, lifetime min/max voltages and currents, calibration date.</w:t>
+      </w:r>
+    </w:p>
+    <w:p>
+      <w:pPr>
+        <w:pStyle w:val="ListParagraph"/>
+        <w:numPr>
+          <w:ilvl w:val="0"/>
+          <w:numId w:val="13"/>
+        </w:numPr>
+      </w:pPr>
+      <w:r>
+        <w:t xml:space="preserve">Exposes a HV-DC power status used by Power Stack to gate DC-link enable.</w:t>
+      </w:r>
+    </w:p>
+    <w:p>
+      <w:pPr>
+        <w:pStyle w:val="Normal"/>
+      </w:pPr>
+    </w:p>
+    <w:p>
+      <w:pPr>
+        <w:pStyle w:val="Normal"/>
+      </w:pPr>
+      <w:r>
+        <w:t xml:space="preserve">• PowerStack: Interface to the Power Conversion System (inverter and modules).</w:t>
+      </w:r>
+    </w:p>
+    <w:p>
+      <w:pPr>
+        <w:pStyle w:val="ListParagraph"/>
+        <w:numPr>
+          <w:ilvl w:val="0"/>
+          <w:numId w:val="13"/>
+        </w:numPr>
+      </w:pPr>
+      <w:r>
+        <w:t xml:space="preserve">Coordinates the power modules, net contactor, master/slave MCCBs and rotation switch.</w:t>
+      </w:r>
+    </w:p>
+    <w:p>
+      <w:pPr>
+        <w:pStyle w:val="ListParagraph"/>
+        <w:numPr>
+          <w:ilvl w:val="0"/>
+          <w:numId w:val="13"/>
+        </w:numPr>
+      </w:pPr>
+      <w:r>
+        <w:t xml:space="preserve">Forwards active/reactive power requests from PowerControl and exposes the inverter operating state (AFE, Island, Microgrid; Droop, Isochronous).</w:t>
+      </w:r>
+    </w:p>
+    <w:p>
+      <w:pPr>
+        <w:pStyle w:val="ListParagraph"/>
+        <w:numPr>
+          <w:ilvl w:val="0"/>
+          <w:numId w:val="13"/>
+        </w:numPr>
+      </w:pPr>
+      <w:r>
+        <w:t xml:space="preserve">Manages cooling requests, transport mode, double-power-module configuration and AC-rotation detection.</w:t>
+      </w:r>
+    </w:p>
+    <w:p>
+      <w:pPr>
+        <w:pStyle w:val="ListParagraph"/>
+        <w:numPr>
+          <w:ilvl w:val="0"/>
+          <w:numId w:val="13"/>
+        </w:numPr>
+      </w:pPr>
+      <w:r>
+        <w:t xml:space="preserve">Provides EDM feedbacks for the Safety program and grid-code trip information.</w:t>
+      </w:r>
+    </w:p>
+    <w:p>
+      <w:pPr>
+        <w:pStyle w:val="Normal"/>
+      </w:pPr>
+    </w:p>
+    <w:p>
+      <w:pPr>
+        <w:pStyle w:val="Normal"/>
+      </w:pPr>
+      <w:r>
+        <w:t xml:space="preserve">• CoolingSystem: Thermal management of the cabinet and the power electronics.</w:t>
+      </w:r>
+    </w:p>
+    <w:p>
+      <w:pPr>
+        <w:pStyle w:val="ListParagraph"/>
+        <w:numPr>
+          <w:ilvl w:val="0"/>
+          <w:numId w:val="13"/>
+        </w:numPr>
+      </w:pPr>
+      <w:r>
+        <w:t xml:space="preserve">Controls fans and the optional heat-pump (Trane or LG variants) based on internal temperatures and Power Stack requests.</w:t>
+      </w:r>
+    </w:p>
+    <w:p>
+      <w:pPr>
+        <w:pStyle w:val="ListParagraph"/>
+        <w:numPr>
+          <w:ilvl w:val="0"/>
+          <w:numId w:val="13"/>
+        </w:numPr>
+      </w:pPr>
+      <w:r>
+        <w:t xml:space="preserve">Switches between off, low-power (internal 400 V AC supply only) and full-power modes depending on cooling demand.</w:t>
+      </w:r>
+    </w:p>
+    <w:p>
+      <w:pPr>
+        <w:pStyle w:val="Normal"/>
+      </w:pPr>
+    </w:p>
+    <w:p>
+      <w:pPr>
+        <w:pStyle w:val="Normal"/>
+      </w:pPr>
+      <w:r>
+        <w:t xml:space="preserve">• Enclosure: Cabinet auxiliaries (climate, doors, LED indicator).</w:t>
+      </w:r>
+    </w:p>
+    <w:p>
+      <w:pPr>
+        <w:pStyle w:val="ListParagraph"/>
+        <w:numPr>
+          <w:ilvl w:val="0"/>
+          <w:numId w:val="13"/>
+        </w:numPr>
+      </w:pPr>
+      <w:r>
+        <w:t xml:space="preserve">Aggregates climate, door-switch and LED-indication sub-FBs.</w:t>
+      </w:r>
+    </w:p>
+    <w:p>
+      <w:pPr>
+        <w:pStyle w:val="ListParagraph"/>
+        <w:numPr>
+          <w:ilvl w:val="0"/>
+          <w:numId w:val="13"/>
+        </w:numPr>
+      </w:pPr>
+      <w:r>
+        <w:t xml:space="preserve">Provides the LED status indication via the Arduino-based LED controller and surfaces door interlock feedbacks.</w:t>
+      </w:r>
+    </w:p>
+    <w:p>
+      <w:pPr>
+        <w:pStyle w:val="Normal"/>
+      </w:pPr>
+    </w:p>
+    <w:p>
+      <w:pPr>
+        <w:pStyle w:val="Normal"/>
+      </w:pPr>
+      <w:r>
+        <w:t xml:space="preserve">• ACSwitchgear (Clientbox): Control and monitoring of the AC switchgear cabinet.</w:t>
+      </w:r>
+    </w:p>
+    <w:p>
+      <w:pPr>
+        <w:pStyle w:val="ListParagraph"/>
+        <w:numPr>
+          <w:ilvl w:val="0"/>
+          <w:numId w:val="13"/>
+        </w:numPr>
+      </w:pPr>
+      <w:r>
+        <w:t xml:space="preserve">Reads breaker positions, alarms and the customer-side I/O.</w:t>
+      </w:r>
+    </w:p>
+    <w:p>
+      <w:pPr>
+        <w:pStyle w:val="ListParagraph"/>
+        <w:numPr>
+          <w:ilvl w:val="0"/>
+          <w:numId w:val="13"/>
+        </w:numPr>
+      </w:pPr>
+      <w:r>
+        <w:t xml:space="preserve">Exposes setpoints, parameters and events through the standard get/set/params/events structures.</w:t>
+      </w:r>
+    </w:p>
+    <w:p>
+      <w:pPr>
+        <w:pStyle w:val="Normal"/>
+      </w:pPr>
+    </w:p>
+    <w:p>
+      <w:pPr>
+        <w:pStyle w:val="Normal"/>
+      </w:pPr>
+      <w:r>
+        <w:t xml:space="preserve">• DCSwitchgear: Control and monitoring of the DC switchgear.</w:t>
+      </w:r>
+    </w:p>
+    <w:p>
+      <w:pPr>
+        <w:pStyle w:val="ListParagraph"/>
+        <w:numPr>
+          <w:ilvl w:val="0"/>
+          <w:numId w:val="13"/>
+        </w:numPr>
+      </w:pPr>
+      <w:r>
+        <w:t xml:space="preserve">Provides feedbacks on DC isolators and contactors used in the battery DC link.</w:t>
+      </w:r>
+    </w:p>
+    <w:p>
+      <w:pPr>
+        <w:pStyle w:val="Normal"/>
+      </w:pPr>
+    </w:p>
+    <w:p>
+      <w:pPr>
+        <w:pStyle w:val="Normal"/>
+      </w:pPr>
+      <w:r>
+        <w:t xml:space="preserve">• NeutralTransformer: Monitoring and control of the neutral-earthing transformer.</w:t>
+      </w:r>
+    </w:p>
+    <w:p>
+      <w:pPr>
+        <w:pStyle w:val="ListParagraph"/>
+        <w:numPr>
+          <w:ilvl w:val="0"/>
+          <w:numId w:val="13"/>
+        </w:numPr>
+      </w:pPr>
+      <w:r>
+        <w:t xml:space="preserve">Reports operating status to the System Monitor.</w:t>
+      </w:r>
+    </w:p>
+    <w:p>
+      <w:pPr>
+        <w:pStyle w:val="ListParagraph"/>
+        <w:numPr>
+          <w:ilvl w:val="0"/>
+          <w:numId w:val="13"/>
+        </w:numPr>
+      </w:pPr>
+      <w:r>
+        <w:t xml:space="preserve">Used by the grid-forming logic to keep neutral-point bonding consistent with the active operating mode.</w:t>
+      </w:r>
+    </w:p>
+    <w:p>
+      <w:pPr>
+        <w:pStyle w:val="Normal"/>
+      </w:pPr>
+    </w:p>
+    <w:p>
+      <w:pPr>
+        <w:pStyle w:val="Normal"/>
+      </w:pPr>
+      <w:r>
+        <w:t xml:space="preserve">• InternalPowerSupply: Internal 24 V / auxiliary supply and UPS supervision.</w:t>
+      </w:r>
+    </w:p>
+    <w:p>
+      <w:pPr>
+        <w:pStyle w:val="ListParagraph"/>
+        <w:numPr>
+          <w:ilvl w:val="0"/>
+          <w:numId w:val="13"/>
+        </w:numPr>
+      </w:pPr>
+      <w:r>
+        <w:t xml:space="preserve">Manages the CEE auxiliary input, internal power demand and UPS charge mode.</w:t>
+      </w:r>
+    </w:p>
+    <w:p>
+      <w:pPr>
+        <w:pStyle w:val="ListParagraph"/>
+        <w:numPr>
+          <w:ilvl w:val="0"/>
+          <w:numId w:val="13"/>
+        </w:numPr>
+      </w:pPr>
+      <w:r>
+        <w:t xml:space="preserve">Implements an orderly low-battery shutdown timer when running on the UPS.</w:t>
+      </w:r>
+    </w:p>
+    <w:p>
+      <w:pPr>
+        <w:pStyle w:val="Normal"/>
+      </w:pPr>
+    </w:p>
+    <w:p>
+      <w:pPr>
+        <w:pStyle w:val="Normal"/>
+      </w:pPr>
+      <w:r>
+        <w:t xml:space="preserve">• ProtectionSystems: Electrical and physical protection devices.</w:t>
+      </w:r>
+    </w:p>
+    <w:p>
+      <w:pPr>
+        <w:pStyle w:val="ListParagraph"/>
+        <w:numPr>
+          <w:ilvl w:val="0"/>
+          <w:numId w:val="13"/>
+        </w:numPr>
+      </w:pPr>
+      <w:r>
+        <w:t xml:space="preserve">Aggregates insulation monitoring, residual-current monitoring, overcurrent protection, surge protection and fire detection.</w:t>
+      </w:r>
+    </w:p>
+    <w:p>
+      <w:pPr>
+        <w:pStyle w:val="ListParagraph"/>
+        <w:numPr>
+          <w:ilvl w:val="0"/>
+          <w:numId w:val="13"/>
+        </w:numPr>
+      </w:pPr>
+      <w:r>
+        <w:t xml:space="preserve">Surfaces trip and warning signals to ErrorHandling so they participate in the system shutdown decision.</w:t>
+      </w:r>
+    </w:p>
+    <w:p>
+      <w:pPr>
+        <w:pStyle w:val="Normal"/>
+      </w:pPr>
+    </w:p>
+    <w:p>
+      <w:pPr>
+        <w:pStyle w:val="Normal"/>
+      </w:pPr>
+      <w:r>
+        <w:t xml:space="preserve">• PowerQualityMonitor: Power-quality and energy measurement (Janitza UMG 801).</w:t>
+      </w:r>
+    </w:p>
+    <w:p>
+      <w:pPr>
+        <w:pStyle w:val="ListParagraph"/>
+        <w:numPr>
+          <w:ilvl w:val="0"/>
+          <w:numId w:val="13"/>
+        </w:numPr>
+      </w:pPr>
+      <w:r>
+        <w:t xml:space="preserve">Reads voltages, currents, power, energy and unbalance values from the meter.</w:t>
+      </w:r>
+    </w:p>
+    <w:p>
+      <w:pPr>
+        <w:pStyle w:val="ListParagraph"/>
+        <w:numPr>
+          <w:ilvl w:val="0"/>
+          <w:numId w:val="13"/>
+        </w:numPr>
+      </w:pPr>
+      <w:r>
+        <w:t xml:space="preserve">Detects grid-code violations such as current unbalance limits and feeds them into the Power Stack trip logic.</w:t>
+      </w:r>
+    </w:p>
+    <w:p>
+      <w:pPr>
+        <w:pStyle w:val="ListParagraph"/>
+        <w:numPr>
+          <w:ilvl w:val="0"/>
+          <w:numId w:val="13"/>
+        </w:numPr>
+      </w:pPr>
+      <w:r>
+        <w:t xml:space="preserve">Maintains persistent counters for energy supplied to and consumed from the BESS.</w:t>
+      </w:r>
+    </w:p>
+    <w:p>
+      <w:pPr>
+        <w:pStyle w:val="Normal"/>
+      </w:pPr>
+    </w:p>
+    <w:p>
+      <w:pPr>
+        <w:pStyle w:val="Normal"/>
+      </w:pPr>
+      <w:r>
+        <w:t xml:space="preserve">• PeakshaveBox: Optional external peak-shaving and energy-management box.</w:t>
+      </w:r>
+    </w:p>
+    <w:p>
+      <w:pPr>
+        <w:pStyle w:val="ListParagraph"/>
+        <w:numPr>
+          <w:ilvl w:val="0"/>
+          <w:numId w:val="13"/>
+        </w:numPr>
+      </w:pPr>
+      <w:r>
+        <w:t xml:space="preserve">Reads metering data from the customer load measurement.</w:t>
+      </w:r>
+    </w:p>
+    <w:p>
+      <w:pPr>
+        <w:pStyle w:val="ListParagraph"/>
+        <w:numPr>
+          <w:ilvl w:val="0"/>
+          <w:numId w:val="13"/>
+        </w:numPr>
+      </w:pPr>
+      <w:r>
+        <w:t xml:space="preserve">Provides setpoints that bias the PowerControl targets to limit grid import/export.</w:t>
+      </w:r>
+    </w:p>
+    <w:p>
+      <w:pPr>
+        <w:pStyle w:val="Normal"/>
+      </w:pPr>
+    </w:p>
+    <w:p>
+      <w:pPr>
+        <w:pStyle w:val="Normal"/>
+      </w:pPr>
+      <w:r>
+        <w:t xml:space="preserve">• HartingIO: Customer Harting connector I/O for digital signals.</w:t>
+      </w:r>
+    </w:p>
+    <w:p>
+      <w:pPr>
+        <w:pStyle w:val="ListParagraph"/>
+        <w:numPr>
+          <w:ilvl w:val="0"/>
+          <w:numId w:val="13"/>
+        </w:numPr>
+      </w:pPr>
+      <w:r>
+        <w:t xml:space="preserve">Maps the customer-accessible digital inputs and outputs (start/stop, status, alarms).</w:t>
+      </w:r>
+    </w:p>
+    <w:p>
+      <w:pPr>
+        <w:pStyle w:val="ListParagraph"/>
+        <w:numPr>
+          <w:ilvl w:val="0"/>
+          <w:numId w:val="13"/>
+        </w:numPr>
+      </w:pPr>
+      <w:r>
+        <w:t xml:space="preserve">Used as one of the possible control sources when remote interfaces are not active.</w:t>
+      </w:r>
+    </w:p>
+    <w:p>
+      <w:pPr>
+        <w:pStyle w:val="Normal"/>
+      </w:pPr>
+    </w:p>
+    <w:p>
+      <w:pPr>
+        <w:pStyle w:val="Normal"/>
+      </w:pPr>
+      <w:r>
+        <w:t xml:space="preserve">• ACDCCharger: AC/DC battery charger interface.</w:t>
+      </w:r>
+    </w:p>
+    <w:p>
+      <w:pPr>
+        <w:pStyle w:val="ListParagraph"/>
+        <w:numPr>
+          <w:ilvl w:val="0"/>
+          <w:numId w:val="13"/>
+        </w:numPr>
+      </w:pPr>
+      <w:r>
+        <w:t xml:space="preserve">Drives the Phoenix Contact / Winline UXR100040G chargers used for auxiliary battery charging.</w:t>
+      </w:r>
+    </w:p>
+    <w:p>
+      <w:pPr>
+        <w:pStyle w:val="ListParagraph"/>
+        <w:numPr>
+          <w:ilvl w:val="0"/>
+          <w:numId w:val="13"/>
+        </w:numPr>
+      </w:pPr>
+      <w:r>
+        <w:t xml:space="preserve">Enforces charging limits based on BMS state-of-charge, system voltage, current and maximum-charge-current feedback.</w:t>
+      </w:r>
+    </w:p>
+    <w:p>
+      <w:pPr>
+        <w:pStyle w:val="Normal"/>
+      </w:pPr>
+    </w:p>
+    <w:p>
+      <w:pPr>
+        <w:pStyle w:val="Normal"/>
+      </w:pPr>
+      <w:r>
+        <w:t xml:space="preserve">• PLCStatus: PLC self-diagnostics and runtime health.</w:t>
+      </w:r>
+    </w:p>
+    <w:p>
+      <w:pPr>
+        <w:pStyle w:val="ListParagraph"/>
+        <w:numPr>
+          <w:ilvl w:val="0"/>
+          <w:numId w:val="13"/>
+        </w:numPr>
+      </w:pPr>
+      <w:r>
+        <w:t xml:space="preserve">Reads the EL9410 power-supply status terminal.</w:t>
+      </w:r>
+    </w:p>
+    <w:p>
+      <w:pPr>
+        <w:pStyle w:val="ListParagraph"/>
+        <w:numPr>
+          <w:ilvl w:val="0"/>
+          <w:numId w:val="13"/>
+        </w:numPr>
+      </w:pPr>
+      <w:r>
+        <w:t xml:space="preserve">Provides PLC state information (cycle status, persistent data, restart events) to the rest of the application.</w:t>
+      </w:r>
+    </w:p>
+    <w:p>
+      <w:pPr>
+        <w:pStyle w:val="ListParagraph"/>
+        <w:numPr>
+          <w:ilvl w:val="0"/>
+          <w:numId w:val="13"/>
+        </w:numPr>
+      </w:pPr>
+      <w:r>
+        <w:t xml:space="preserve">Supports the controlled PLC update workflow through FB_PLCUpdate.</w:t>
+      </w:r>
+    </w:p>
+    <w:p>
+      <w:pPr>
+        <w:pStyle w:val="Normal"/>
+      </w:pPr>
+    </w:p>
+    <w:p>
+      <w:pPr>
+        <w:pStyle w:val="Normal"/>
+      </w:pPr>
+      <w:r>
+        <w:t xml:space="preserve">• GenComm: Genset interface and Geneset controller communication.</w:t>
+      </w:r>
+    </w:p>
+    <w:p>
+      <w:pPr>
+        <w:pStyle w:val="ListParagraph"/>
+        <w:numPr>
+          <w:ilvl w:val="0"/>
+          <w:numId w:val="13"/>
+        </w:numPr>
+      </w:pPr>
+      <w:r>
+        <w:t xml:space="preserve">Wraps the DEIF AGC-150 controller interface for generator monitoring and control.</w:t>
+      </w:r>
+    </w:p>
+    <w:p>
+      <w:pPr>
+        <w:pStyle w:val="ListParagraph"/>
+        <w:numPr>
+          <w:ilvl w:val="0"/>
+          <w:numId w:val="13"/>
+        </w:numPr>
+      </w:pPr>
+      <w:r>
+        <w:t xml:space="preserve">Exchanges generator status, load-share and start/stop commands used by GenGridControl in hybrid operation.</w:t>
+      </w:r>
+    </w:p>
+    <w:p>
+      <w:pPr>
+        <w:pStyle w:val="Normal"/>
+      </w:pPr>
+    </w:p>
+    <w:p>
+      <w:pPr>
+        <w:pStyle w:val="Normal"/>
+      </w:pPr>
+      <w:r>
+        <w:t xml:space="preserve">• 4Grouter (Teltonika): Cellular router supervision.</w:t>
+      </w:r>
+    </w:p>
+    <w:p>
+      <w:pPr>
+        <w:pStyle w:val="ListParagraph"/>
+        <w:numPr>
+          <w:ilvl w:val="0"/>
+          <w:numId w:val="13"/>
+        </w:numPr>
+      </w:pPr>
+      <w:r>
+        <w:t xml:space="preserve">Monitors the Teltonika 4G router availability and signal quality.</w:t>
+      </w:r>
+    </w:p>
+    <w:p>
+      <w:pPr>
+        <w:pStyle w:val="ListParagraph"/>
+        <w:numPr>
+          <w:ilvl w:val="0"/>
+          <w:numId w:val="13"/>
+        </w:numPr>
+      </w:pPr>
+      <w:r>
+        <w:t xml:space="preserve">Provides the remote-access transport layer used by the IoT module.</w:t>
+      </w:r>
+    </w:p>
+    <w:p>
+      <w:pPr>
+        <w:pStyle w:val="Normal"/>
+      </w:pPr>
     </w:p>
     <w:p>
       <w:pPr>
@@ -812,257 +1903,243 @@
     </w:p>
     <w:p>
       <w:r>
+        <w:t xml:space="preserve">Fast Task (PlcTask) – 2 ms cycle, priority 4. Executes MAIN_Fast.</w:t>
+      </w:r>
+      <w:r>
         <w:br/>
-        <w:t>Fast Task (PlcTask)</w:t>
+        <w:t xml:space="preserve">- Real-time device control (Power Stack, BMS, switchgear, cooling, protections, internal supply)</w:t>
       </w:r>
       <w:r>
         <w:br/>
-        <w:t>- Real-time control execution</w:t>
+        <w:t xml:space="preserve">- Closed-loop power and grid/genset control (PowerControl, GenGridControl)</w:t>
       </w:r>
       <w:r>
         <w:br/>
-        <w:t>- Power control</w:t>
+        <w:t xml:space="preserve">- Safety-relevant signal handling and EDM feedbacks</w:t>
       </w:r>
       <w:r>
         <w:br/>
-        <w:t>- Safety-critical monitoring</w:t>
+        <w:t xml:space="preserve">- Update of the shared ST_System_Monitor structure exchanged with the slow task</w:t>
       </w:r>
       <w:r>
         <w:br/>
-        <w:t>- Device control</w:t>
       </w:r>
       <w:r>
         <w:br/>
+        <w:t xml:space="preserve">Slow Task (MonitorControlTask) – 10 ms cycle, priority 8. Executes MAIN_Slow.</w:t>
       </w:r>
       <w:r>
         <w:br/>
-        <w:t>Slow Task (MonitorControlTask)</w:t>
+        <w:t xml:space="preserve">- ControlManager (HMI, IoT, PROFINET, test scripts, persistent settings)</w:t>
       </w:r>
       <w:r>
         <w:br/>
-        <w:t>- HMI updates</w:t>
+        <w:t xml:space="preserve">- ErrorHandling, EventLogger and Datalogger</w:t>
       </w:r>
       <w:r>
         <w:br/>
-        <w:t>- Communications</w:t>
+        <w:t xml:space="preserve">- Long-running communications and diagnostics</w:t>
       </w:r>
       <w:r>
         <w:br/>
-        <w:t>- Data logging</w:t>
       </w:r>
       <w:r>
         <w:br/>
-        <w:t>- Diagnostics</w:t>
+        <w:t xml:space="preserve">Safety Task – runs the TwinSAFE Safety program on a dedicated safety runtime, independently of the standard PLC tasks.</w:t>
+      </w:r>
+    </w:p>
+    <w:p/>
+    <w:p>
+      <w:pPr>
+        <w:pStyle w:val="Heading1"/>
+      </w:pPr>
+      <w:r>
+        <w:t>5. Operational States</w:t>
+      </w:r>
+    </w:p>
+    <w:p>
+      <w:r>
+        <w:t xml:space="preserve">The system state is represented by the eSystemState enumeration with the following values: Off, Shutdown, StandBy, Conditioning, Starting, Running, Charging_Only, Discharging_Only, Stopped, EMstop, Reset, Init, Transport and Dehumidifying.</w:t>
       </w:r>
       <w:r>
         <w:br/>
-        <w:t>- Event processing</w:t>
       </w:r>
       <w:r>
         <w:br/>
-      </w:r>
-    </w:p>
-    <w:p/>
+        <w:t xml:space="preserve">Operation mode is selected via the eOperationMode enumeration (Auto, Gridfollowing, GridForming). The active Power-Stack modes are described by ePowerModes (DroopZeroStart, Droop, Isochronous) and eInverterModes (AFE, Island, Microgrid).</w:t>
+      </w:r>
+      <w:r>
+        <w:br/>
+      </w:r>
+      <w:r>
+        <w:br/>
+        <w:t xml:space="preserve">State transitions are driven by ControlManager (operator and remote commands), GenGridControl (automatic start/stop on SOC, load and bus availability) and the Safety program (emergency-stop and critical-fault paths).</w:t>
+      </w:r>
+      <w:r>
+        <w:br/>
+      </w:r>
+      <w:r>
+        <w:br/>
+        <w:t xml:space="preserve">Add state-transition diagram in Appendix B.</w:t>
+      </w:r>
+    </w:p>
     <w:p>
       <w:pPr>
         <w:pStyle w:val="Heading1"/>
       </w:pPr>
       <w:r>
-        <w:t>5. Operational States</w:t>
-      </w:r>
-    </w:p>
-    <w:p>
+        <w:t>6. Object-Level Design</w:t>
+      </w:r>
+    </w:p>
+    <w:p>
+      <w:r>
+        <w:t xml:space="preserve">BMS:</w:t>
+      </w:r>
       <w:r>
         <w:br/>
-        <w:t>Init → Ready → Standby → Charging → Discharging → Fault → Emergency Shutdown</w:t>
+        <w:t xml:space="preserve">- SOC, SOH, system voltage, current and temperature monitoring</w:t>
       </w:r>
       <w:r>
         <w:br/>
+        <w:t xml:space="preserve">- Battery warnings and faults derived from MBMU / SBMU status words</w:t>
       </w:r>
       <w:r>
         <w:br/>
-        <w:t>Add state transition diagram here.</w:t>
+        <w:t xml:space="preserve">- Persistent cycle counter and lifetime energy / min-max statistics</w:t>
       </w:r>
       <w:r>
         <w:br/>
       </w:r>
+      <w:r>
+        <w:br/>
+        <w:t xml:space="preserve">PowerStack:</w:t>
+      </w:r>
+      <w:r>
+        <w:br/>
+        <w:t xml:space="preserve">- Active and reactive power requests forwarded to the inverter</w:t>
+      </w:r>
+      <w:r>
+        <w:br/>
+        <w:t xml:space="preserve">- Net contactor, master / slave MCCB and AC-rotation switch control with EDM feedbacks</w:t>
+      </w:r>
+      <w:r>
+        <w:br/>
+        <w:t xml:space="preserve">- Inverter and power-mode state machines (AFE / Island / Microgrid; Droop / Isochronous)</w:t>
+      </w:r>
+      <w:r>
+        <w:br/>
+      </w:r>
+      <w:r>
+        <w:br/>
+        <w:t xml:space="preserve">CoolingSystem:</w:t>
+      </w:r>
+      <w:r>
+        <w:br/>
+        <w:t xml:space="preserve">- Cabinet and power-electronics thermal management</w:t>
+      </w:r>
+      <w:r>
+        <w:br/>
+        <w:t xml:space="preserve">- Fan and heat-pump (Trane / LG) control with multi-level power requests</w:t>
+      </w:r>
+      <w:r>
+        <w:br/>
+      </w:r>
+      <w:r>
+        <w:br/>
+        <w:t xml:space="preserve">ProtectionSystems:</w:t>
+      </w:r>
+      <w:r>
+        <w:br/>
+        <w:t xml:space="preserve">- Insulation monitoring, residual-current monitoring, overcurrent and surge protection, fire detection</w:t>
+      </w:r>
+      <w:r>
+        <w:br/>
+        <w:t xml:space="preserve">- Trip aggregation into the global shutdown logic</w:t>
+      </w:r>
+      <w:r>
+        <w:br/>
+      </w:r>
+      <w:r>
+        <w:br/>
+        <w:t xml:space="preserve">PowerQualityMonitor:</w:t>
+      </w:r>
+      <w:r>
+        <w:br/>
+        <w:t xml:space="preserve">- Janitza UMG 801 measurements and energy counters</w:t>
+      </w:r>
+      <w:r>
+        <w:br/>
+        <w:t xml:space="preserve">- Current-unbalance and grid-code violation detection</w:t>
+      </w:r>
+      <w:r>
+        <w:br/>
+      </w:r>
+      <w:r>
+        <w:br/>
+        <w:t xml:space="preserve">Safety:</w:t>
+      </w:r>
+      <w:r>
+        <w:br/>
+        <w:t xml:space="preserve">- TwinSAFE program with E-Stop, EDM monitoring and safe-state transition</w:t>
+      </w:r>
+      <w:r>
+        <w:br/>
+        <w:t xml:space="preserve">- Interface structures ST_Safety_ContactorEDM, ST_Safety_ToSafetyPrg, ST_Safety_get</w:t>
+      </w:r>
     </w:p>
     <w:p>
       <w:pPr>
         <w:pStyle w:val="Heading1"/>
       </w:pPr>
       <w:r>
-        <w:t>6. Object-Level Design</w:t>
-      </w:r>
-    </w:p>
-    <w:p>
+        <w:t>7. Safety Design</w:t>
+      </w:r>
+    </w:p>
+    <w:p>
+      <w:r>
+        <w:t xml:space="preserve">Safety Program (TwinSAFE):</w:t>
+      </w:r>
       <w:r>
         <w:br/>
-        <w:t>BMS:</w:t>
+        <w:t xml:space="preserve">- External and panel emergency-stop handling</w:t>
       </w:r>
       <w:r>
         <w:br/>
-        <w:t>- SOC, SOH, voltage, current, temperature monitoring</w:t>
+        <w:t xml:space="preserve">- Contactor EDM monitoring for the net contactor and master / slave MCCBs</w:t>
       </w:r>
       <w:r>
         <w:br/>
-        <w:t>- Battery alarms and faults</w:t>
+        <w:t xml:space="preserve">- Manual reset with debounced reset timer</w:t>
       </w:r>
       <w:r>
         <w:br/>
+        <w:t xml:space="preserve">- Drives the global emergency-shutdown flag and the safe-state transition of the application</w:t>
       </w:r>
       <w:r>
         <w:br/>
-        <w:t>PowerStack:</w:t>
       </w:r>
       <w:r>
         <w:br/>
-      </w:r>
-      <w:r>
-        <w:lastRenderedPageBreak/>
-        <w:t>- Active/reactive power commands</w:t>
+        <w:t xml:space="preserve">Interface structures:</w:t>
       </w:r>
       <w:r>
         <w:br/>
-        <w:t>- PCS status monitoring</w:t>
+        <w:t xml:space="preserve">- ST_Safety_ContactorEDM</w:t>
       </w:r>
       <w:r>
         <w:br/>
+        <w:t xml:space="preserve">- ST_Safety_ToSafetyPrg (outputs to the safety runtime)</w:t>
       </w:r>
       <w:r>
         <w:br/>
-        <w:t>CoolingSystem:</w:t>
+        <w:t xml:space="preserve">- ST_Safety_get (feedbacks from the safety runtime)</w:t>
       </w:r>
       <w:r>
         <w:br/>
-        <w:t>- Thermal management</w:t>
       </w:r>
       <w:r>
         <w:br/>
-        <w:t>- Fan and HVAC supervision</w:t>
-      </w:r>
-      <w:r>
-        <w:br/>
-      </w:r>
-      <w:r>
-        <w:br/>
-        <w:t>ACSwitchgear / DCSwitchgear:</w:t>
-      </w:r>
-      <w:r>
-        <w:br/>
-        <w:t>- Breaker and contactor status</w:t>
-      </w:r>
-      <w:r>
-        <w:br/>
-        <w:t>- Interlocking logic</w:t>
-      </w:r>
-      <w:r>
-        <w:br/>
-      </w:r>
-      <w:r>
-        <w:br/>
-        <w:t>ProtectionSystems:</w:t>
-      </w:r>
-      <w:r>
-        <w:br/>
-        <w:t>- Relay status</w:t>
-      </w:r>
-      <w:r>
-        <w:br/>
-        <w:t>- Protection trips</w:t>
-      </w:r>
-      <w:r>
-        <w:br/>
-      </w:r>
-      <w:r>
-        <w:br/>
-        <w:t>PowerQualityMonitor:</w:t>
-      </w:r>
-      <w:r>
-        <w:br/>
-        <w:t>- Voltage, frequency and power quality supervision</w:t>
-      </w:r>
-      <w:r>
-        <w:br/>
-      </w:r>
-      <w:r>
-        <w:br/>
-        <w:t>InternalPowerSupply:</w:t>
-      </w:r>
-      <w:r>
-        <w:br/>
-        <w:t>- Auxiliary supply monitoring</w:t>
-      </w:r>
-      <w:r>
-        <w:br/>
-      </w:r>
-      <w:r>
-        <w:br/>
-        <w:t>4Grouter:</w:t>
-      </w:r>
-      <w:r>
-        <w:br/>
-        <w:t>- Remote connectivity mo</w:t>
-      </w:r>
-      <w:r>
-        <w:t>nitoring</w:t>
-      </w:r>
-      <w:r>
-        <w:br/>
-      </w:r>
-    </w:p>
-    <w:p>
-      <w:pPr>
-        <w:pStyle w:val="Heading1"/>
-      </w:pPr>
-      <w:r>
-        <w:t>7. Safety Design</w:t>
-      </w:r>
-    </w:p>
-    <w:p>
-      <w:r>
-        <w:br/>
-        <w:t>Safety Program:</w:t>
-      </w:r>
-      <w:r>
-        <w:br/>
-        <w:t>- Emergency Stop</w:t>
-      </w:r>
-      <w:r>
-        <w:br/>
-        <w:t>- Contactor EDM monitoring</w:t>
-      </w:r>
-      <w:r>
-        <w:br/>
-        <w:t>- Critical fault shutdown</w:t>
-      </w:r>
-      <w:r>
-        <w:br/>
-        <w:t>- Safe-state transition</w:t>
-      </w:r>
-      <w:r>
-        <w:br/>
-      </w:r>
-      <w:r>
-        <w:br/>
-        <w:t>Structures:</w:t>
-      </w:r>
-      <w:r>
-        <w:br/>
-        <w:t>- ST_Safety_ContactorEDM</w:t>
-      </w:r>
-      <w:r>
-        <w:br/>
-        <w:t>- ST_Safety_Get</w:t>
-      </w:r>
-      <w:r>
-        <w:br/>
-      </w:r>
-      <w:r>
-        <w:t>- ST_Safety_ToSafetyPrg</w:t>
-      </w:r>
-      <w:r>
-        <w:br/>
+        <w:t xml:space="preserve">Lifetime statistics (E-Stop activations, power-module door openings, safety-stop count) are tracked through FB_VarLogger and persisted by the WearLogging module.</w:t>
       </w:r>
     </w:p>
     <w:p>
@@ -1076,35 +2153,111 @@
     </w:p>
     <w:p>
       <w:r>
+        <w:t xml:space="preserve">Field bus and I/O backbone:</w:t>
+      </w:r>
+      <w:r>
         <w:br/>
-        <w:t>BMS: CAN Bus</w:t>
+        <w:t xml:space="preserve">- EtherCAT for all on-board I/O terminals (EL / KL series), the TwinSAFE coupler and the Janitza UMG 801 power-quality meter.</w:t>
       </w:r>
       <w:r>
         <w:br/>
-        <w:t>PCS: Modbus TCP/RTU</w:t>
       </w:r>
       <w:r>
         <w:br/>
-        <w:t>HMI: Ethernet</w:t>
+        <w:t xml:space="preserve">Battery Management System (BMS):</w:t>
       </w:r>
       <w:r>
         <w:br/>
-        <w:t>EMS/SCADA: Modbus TCP</w:t>
+        <w:t xml:space="preserve">- MBMU / SBMU status data exchange; CAN-bus communication faults between MBMU and SBMUs are surfaced as warnings/faults inside FB_BMS_IO.</w:t>
       </w:r>
       <w:r>
         <w:br/>
-        <w:t>IoT/Remote Access: 4G Router and GenComm modules</w:t>
       </w:r>
       <w:r>
         <w:br/>
+        <w:t xml:space="preserve">Power Stack / Power Modules:</w:t>
       </w:r>
       <w:r>
         <w:br/>
-        <w:t>(Add register maps and protocol details)</w:t>
+        <w:t xml:space="preserve">- Modbus RTU master via the KL6x22B serial terminal (ModbusRtuMasterV2_KL6x22B).</w:t>
       </w:r>
       <w:r>
         <w:br/>
       </w:r>
+      <w:r>
+        <w:br/>
+        <w:t xml:space="preserve">Cooling system (heat pump):</w:t>
+      </w:r>
+      <w:r>
+        <w:br/>
+        <w:t xml:space="preserve">- Modbus interface to the selected heat-pump variant (Trane / LG).</w:t>
+      </w:r>
+      <w:r>
+        <w:br/>
+      </w:r>
+      <w:r>
+        <w:br/>
+        <w:t xml:space="preserve">External / SCADA controller:</w:t>
+      </w:r>
+      <w:r>
+        <w:br/>
+        <w:t xml:space="preserve">- PROFINET coupler (Beckhoff EL669x) handled by FB_ExternalController; active only when configured.</w:t>
+      </w:r>
+      <w:r>
+        <w:br/>
+      </w:r>
+      <w:r>
+        <w:br/>
+        <w:t xml:space="preserve">Remote telemetry and control:</w:t>
+      </w:r>
+      <w:r>
+        <w:br/>
+        <w:t xml:space="preserve">- MQTT over TLS to the OpenRemote broker (FB_IotMqttClient).</w:t>
+      </w:r>
+      <w:r>
+        <w:br/>
+        <w:t xml:space="preserve">- Inter-machine communication between parallel units also uses MQTT.</w:t>
+      </w:r>
+      <w:r>
+        <w:br/>
+      </w:r>
+      <w:r>
+        <w:br/>
+        <w:t xml:space="preserve">Genset:</w:t>
+      </w:r>
+      <w:r>
+        <w:br/>
+        <w:t xml:space="preserve">- DEIF AGC-150 controller interface (FB_AGC150) for monitoring and load-share.</w:t>
+      </w:r>
+      <w:r>
+        <w:br/>
+      </w:r>
+      <w:r>
+        <w:br/>
+        <w:t xml:space="preserve">Connectivity:</w:t>
+      </w:r>
+      <w:r>
+        <w:br/>
+        <w:t xml:space="preserve">- Teltonika 4G router (FB_Teltonika) provides the wide-area transport for the IoT module.</w:t>
+      </w:r>
+      <w:r>
+        <w:br/>
+      </w:r>
+      <w:r>
+        <w:br/>
+        <w:t xml:space="preserve">Customer I/O:</w:t>
+      </w:r>
+      <w:r>
+        <w:br/>
+        <w:t xml:space="preserve">- Harting connector digital I/O (FB_HartingIO) for hard-wired start/stop, status and alarm exchange.</w:t>
+      </w:r>
+      <w:r>
+        <w:br/>
+      </w:r>
+      <w:r>
+        <w:br/>
+        <w:t xml:space="preserve">Detailed register maps and message catalogues are listed in Appendices D and E.</w:t>
+      </w:r>
     </w:p>
     <w:p>
       <w:pPr>
@@ -1116,91 +2269,78 @@
     </w:p>
     <w:p>
       <w:r>
+        <w:t xml:space="preserve">The HMI is implemented with TwinCAT 3 HMI and organised in the following screen groups, matching the content files of the TcHmi_ePU10 project:</w:t>
+      </w:r>
+      <w:r>
         <w:br/>
-        <w:t>Screens:</w:t>
       </w:r>
       <w:r>
         <w:br/>
-        <w:t>- Dashboard</w:t>
+        <w:t xml:space="preserve">1. Overview – system overview and live monitoring plots</w:t>
       </w:r>
       <w:r>
         <w:br/>
-        <w:t>- Battery Overview</w:t>
+        <w:t xml:space="preserve">2. Operation Controls – grid input, genset input, output parallel operation, DC-bus extension and DC charger, peak-shave box, system and earthing-system settings</w:t>
       </w:r>
       <w:r>
         <w:br/>
-        <w:t>- PCS Overview</w:t>
+        <w:t xml:space="preserve">3. Diagnostics</w:t>
       </w:r>
       <w:r>
         <w:br/>
-        <w:t>- Alarms</w:t>
+        <w:t xml:space="preserve">4. Machine Status – Power Stack (single / double inverter, raw data), Battery, Auxiliaries, Monitoring, Cooling System, External Controller, IoT Controller, PROFINET Controller, Peak-Shave Box, PLC and DC Bus</w:t>
       </w:r>
       <w:r>
         <w:br/>
-        <w:t>- Event History</w:t>
+        <w:t xml:space="preserve">5. Settings – Configuration, Power Stack, Cooling System, Enclosure, ZPT, Internal PSU, Battery, Protections, System, HMI, External Control</w:t>
       </w:r>
       <w:r>
         <w:br/>
-        <w:t>- Trends</w:t>
+        <w:t xml:space="preserve">6. Historics and additional screens (Scheduler, Login, Shutdown / Stop warnings, Waiting screen, IoT data-sharing settings)</w:t>
       </w:r>
       <w:r>
         <w:br/>
-        <w:t>- Settings</w:t>
       </w:r>
       <w:r>
         <w:br/>
-        <w:t>- Service Menu</w:t>
+        <w:t xml:space="preserve">(Add screenshots in Appendix F.)</w:t>
+      </w:r>
+    </w:p>
+    <w:p>
+      <w:pPr>
+        <w:pStyle w:val="Heading1"/>
+      </w:pPr>
+      <w:r>
+        <w:t>10. Verification &amp; Validation</w:t>
+      </w:r>
+    </w:p>
+    <w:p>
+      <w:r>
+        <w:t xml:space="preserve">- Unit Testing – isolated test scripts driven by FB_TestScripts and inspectable from the HMI.</w:t>
       </w:r>
       <w:r>
         <w:br/>
+        <w:t xml:space="preserve">- Integration Testing – combined exercise of MAIN_Fast and MAIN_Slow against simulated I/O.</w:t>
       </w:r>
       <w:r>
         <w:br/>
-        <w:t>(Add screenshots)</w:t>
+        <w:t xml:space="preserve">- Factory Acceptance Testing (FAT) – functional verification on the assembled unit.</w:t>
       </w:r>
       <w:r>
         <w:br/>
-      </w:r>
-    </w:p>
-    <w:p>
-      <w:pPr>
-        <w:pStyle w:val="Heading1"/>
-      </w:pPr>
-      <w:r>
-        <w:t>10. Verification &amp; Validation</w:t>
-      </w:r>
-    </w:p>
-    <w:p>
+        <w:t xml:space="preserve">- Site Acceptance Testing (SAT) – verification on site against the customer specification.</w:t>
+      </w:r>
       <w:r>
         <w:br/>
-        <w:t>- Unit Testing</w:t>
+        <w:t xml:space="preserve">- Communication Testing – BMS, Power Stack Modbus, PROFINET coupler, MQTT (IoT and inter-machine), Genset and 4G router.</w:t>
       </w:r>
       <w:r>
         <w:br/>
-        <w:t>- Integration Testing</w:t>
+        <w:t xml:space="preserve">- Safety Verification – TwinSAFE program validation, EDM monitoring, emergency-stop and safe-state transition.</w:t>
       </w:r>
       <w:r>
         <w:br/>
-        <w:t>- FAT</w:t>
-      </w:r>
-      <w:r>
-        <w:br/>
-        <w:t>- SAT</w:t>
-      </w:r>
-      <w:r>
-        <w:br/>
-        <w:t>- Communication Testing</w:t>
-      </w:r>
-      <w:r>
-        <w:br/>
-        <w:t>- Safety Verification</w:t>
-      </w:r>
-      <w:r>
-        <w:br/>
-        <w:t>- Cybersecurity Verification</w:t>
-      </w:r>
-      <w:r>
-        <w:br/>
+        <w:t xml:space="preserve">- Cybersecurity Verification – TLS configuration of the MQTT link and user-access checks on the HMI.</w:t>
       </w:r>
     </w:p>
     <w:p>

</xml_diff>

<commit_message>
Senior-architect review: tables, acronyms, cross-cutting concerns, doc-control
</commit_message>
<xml_diff>
--- a/HADI/E-PU10_V2_SDD_Template.docx
+++ b/HADI/E-PU10_V2_SDD_Template.docx
@@ -12,29 +12,439 @@
     </w:p>
     <w:p>
       <w:r>
-        <w:t>Product: E-PU10 V2 Battery Energy Storage System (BESS)</w:t>
-      </w:r>
-      <w:r>
-        <w:br/>
-        <w:t>Platform: Beckhoff TwinCAT 3 PLC</w:t>
-      </w:r>
-      <w:r>
-        <w:br/>
-        <w:t>Software Version: __________</w:t>
-      </w:r>
-      <w:r>
-        <w:br/>
-        <w:t>Document Number: __________</w:t>
-      </w:r>
-      <w:r>
-        <w:br/>
-        <w:t>Revision: __________</w:t>
-      </w:r>
-      <w:r>
-        <w:br/>
-        <w:t>Date: __________</w:t>
-      </w:r>
-    </w:p>
+        <w:t xml:space="preserve">Product: E-PU10 V2 Battery Energy Storage System (BESS) — Platform: Beckhoff TwinCAT 3 PLC</w:t>
+      </w:r>
+    </w:p>
+    <w:tbl>
+      <w:tblPr>
+        <w:tblStyle w:val="TableGrid"/>
+        <w:tblW w:type="auto" w:w="0"/>
+        <w:tblLook w:firstColumn="1" w:firstRow="1" w:lastColumn="0" w:lastRow="0" w:noHBand="0" w:noVBand="1" w:val="04A0"/>
+      </w:tblPr>
+      <w:tblGrid>
+        <w:gridCol w:w="4320"/>
+        <w:gridCol w:w="4320"/>
+      </w:tblGrid>
+      <w:tr>
+        <w:tc>
+          <w:tcPr>
+            <w:tcW w:type="dxa" w:w="2835"/>
+          </w:tcPr>
+          <w:p>
+            <w:r/>
+            <w:r>
+              <w:rPr>
+                <w:b/>
+              </w:rPr>
+              <w:t>Item</w:t>
+            </w:r>
+          </w:p>
+        </w:tc>
+        <w:tc>
+          <w:tcPr>
+            <w:tcW w:type="dxa" w:w="6236"/>
+          </w:tcPr>
+          <w:p>
+            <w:r/>
+            <w:r>
+              <w:rPr>
+                <w:b/>
+              </w:rPr>
+              <w:t>Value</w:t>
+            </w:r>
+          </w:p>
+        </w:tc>
+      </w:tr>
+      <w:tr>
+        <w:tc>
+          <w:tcPr>
+            <w:tcW w:type="dxa" w:w="2835"/>
+          </w:tcPr>
+          <w:p>
+            <w:r/>
+            <w:r>
+              <w:t>Document Title</w:t>
+            </w:r>
+          </w:p>
+        </w:tc>
+        <w:tc>
+          <w:tcPr>
+            <w:tcW w:type="dxa" w:w="6236"/>
+          </w:tcPr>
+          <w:p>
+            <w:r/>
+            <w:r>
+              <w:t>Software Design Document — E-PU10 V2 BESS Controller</w:t>
+            </w:r>
+          </w:p>
+        </w:tc>
+      </w:tr>
+      <w:tr>
+        <w:tc>
+          <w:tcPr>
+            <w:tcW w:type="dxa" w:w="2835"/>
+          </w:tcPr>
+          <w:p>
+            <w:r/>
+            <w:r>
+              <w:t>Product</w:t>
+            </w:r>
+          </w:p>
+        </w:tc>
+        <w:tc>
+          <w:tcPr>
+            <w:tcW w:type="dxa" w:w="6236"/>
+          </w:tcPr>
+          <w:p>
+            <w:r/>
+            <w:r>
+              <w:t>E-PU10 V2 Battery Energy Storage System (BESS)</w:t>
+            </w:r>
+          </w:p>
+        </w:tc>
+      </w:tr>
+      <w:tr>
+        <w:tc>
+          <w:tcPr>
+            <w:tcW w:type="dxa" w:w="2835"/>
+          </w:tcPr>
+          <w:p>
+            <w:r/>
+            <w:r>
+              <w:t>Platform</w:t>
+            </w:r>
+          </w:p>
+        </w:tc>
+        <w:tc>
+          <w:tcPr>
+            <w:tcW w:type="dxa" w:w="6236"/>
+          </w:tcPr>
+          <w:p>
+            <w:r/>
+            <w:r>
+              <w:t>Beckhoff TwinCAT 3 PLC (TC 3.1.4024)</w:t>
+            </w:r>
+          </w:p>
+        </w:tc>
+      </w:tr>
+      <w:tr>
+        <w:tc>
+          <w:tcPr>
+            <w:tcW w:type="dxa" w:w="2835"/>
+          </w:tcPr>
+          <w:p>
+            <w:r/>
+            <w:r>
+              <w:t>TwinCAT Project</w:t>
+            </w:r>
+          </w:p>
+        </w:tc>
+        <w:tc>
+          <w:tcPr>
+            <w:tcW w:type="dxa" w:w="6236"/>
+          </w:tcPr>
+          <w:p>
+            <w:r/>
+            <w:r>
+              <w:t>ePU10_TC4024-Development / e-PU10</w:t>
+            </w:r>
+          </w:p>
+        </w:tc>
+      </w:tr>
+      <w:tr>
+        <w:tc>
+          <w:tcPr>
+            <w:tcW w:type="dxa" w:w="2835"/>
+          </w:tcPr>
+          <w:p>
+            <w:r/>
+            <w:r>
+              <w:t>Software Version</w:t>
+            </w:r>
+          </w:p>
+        </w:tc>
+        <w:tc>
+          <w:tcPr>
+            <w:tcW w:type="dxa" w:w="6236"/>
+          </w:tcPr>
+          <w:p>
+            <w:r/>
+            <w:r>
+              <w:t>__________</w:t>
+            </w:r>
+          </w:p>
+        </w:tc>
+      </w:tr>
+      <w:tr>
+        <w:tc>
+          <w:tcPr>
+            <w:tcW w:type="dxa" w:w="2835"/>
+          </w:tcPr>
+          <w:p>
+            <w:r/>
+            <w:r>
+              <w:t>Document Number</w:t>
+            </w:r>
+          </w:p>
+        </w:tc>
+        <w:tc>
+          <w:tcPr>
+            <w:tcW w:type="dxa" w:w="6236"/>
+          </w:tcPr>
+          <w:p>
+            <w:r/>
+            <w:r>
+              <w:t>__________</w:t>
+            </w:r>
+          </w:p>
+        </w:tc>
+      </w:tr>
+      <w:tr>
+        <w:tc>
+          <w:tcPr>
+            <w:tcW w:type="dxa" w:w="2835"/>
+          </w:tcPr>
+          <w:p>
+            <w:r/>
+            <w:r>
+              <w:t>Revision</w:t>
+            </w:r>
+          </w:p>
+        </w:tc>
+        <w:tc>
+          <w:tcPr>
+            <w:tcW w:type="dxa" w:w="6236"/>
+          </w:tcPr>
+          <w:p>
+            <w:r/>
+            <w:r>
+              <w:t>__________</w:t>
+            </w:r>
+          </w:p>
+        </w:tc>
+      </w:tr>
+      <w:tr>
+        <w:tc>
+          <w:tcPr>
+            <w:tcW w:type="dxa" w:w="2835"/>
+          </w:tcPr>
+          <w:p>
+            <w:r/>
+            <w:r>
+              <w:t>Date</w:t>
+            </w:r>
+          </w:p>
+        </w:tc>
+        <w:tc>
+          <w:tcPr>
+            <w:tcW w:type="dxa" w:w="6236"/>
+          </w:tcPr>
+          <w:p>
+            <w:r/>
+            <w:r>
+              <w:t>__________</w:t>
+            </w:r>
+          </w:p>
+        </w:tc>
+      </w:tr>
+      <w:tr>
+        <w:tc>
+          <w:tcPr>
+            <w:tcW w:type="dxa" w:w="2835"/>
+          </w:tcPr>
+          <w:p>
+            <w:r/>
+            <w:r>
+              <w:t>Author</w:t>
+            </w:r>
+          </w:p>
+        </w:tc>
+        <w:tc>
+          <w:tcPr>
+            <w:tcW w:type="dxa" w:w="6236"/>
+          </w:tcPr>
+          <w:p>
+            <w:r/>
+            <w:r>
+              <w:t>__________</w:t>
+            </w:r>
+          </w:p>
+        </w:tc>
+      </w:tr>
+      <w:tr>
+        <w:tc>
+          <w:tcPr>
+            <w:tcW w:type="dxa" w:w="2835"/>
+          </w:tcPr>
+          <w:p>
+            <w:r/>
+            <w:r>
+              <w:t>Reviewed by</w:t>
+            </w:r>
+          </w:p>
+        </w:tc>
+        <w:tc>
+          <w:tcPr>
+            <w:tcW w:type="dxa" w:w="6236"/>
+          </w:tcPr>
+          <w:p>
+            <w:r/>
+            <w:r>
+              <w:t>__________</w:t>
+            </w:r>
+          </w:p>
+        </w:tc>
+      </w:tr>
+      <w:tr>
+        <w:tc>
+          <w:tcPr>
+            <w:tcW w:type="dxa" w:w="2835"/>
+          </w:tcPr>
+          <w:p>
+            <w:r/>
+            <w:r>
+              <w:t>Approved by</w:t>
+            </w:r>
+          </w:p>
+        </w:tc>
+        <w:tc>
+          <w:tcPr>
+            <w:tcW w:type="dxa" w:w="6236"/>
+          </w:tcPr>
+          <w:p>
+            <w:r/>
+            <w:r>
+              <w:t>__________</w:t>
+            </w:r>
+          </w:p>
+        </w:tc>
+      </w:tr>
+    </w:tbl>
+    <w:p>
+      <w:pPr>
+        <w:pStyle w:val="Heading2"/>
+      </w:pPr>
+      <w:r>
+        <w:t xml:space="preserve">Revision History</w:t>
+      </w:r>
+    </w:p>
+    <w:tbl>
+      <w:tblPr>
+        <w:tblStyle w:val="TableGrid"/>
+        <w:tblW w:type="auto" w:w="0"/>
+        <w:tblLook w:firstColumn="1" w:firstRow="1" w:lastColumn="0" w:lastRow="0" w:noHBand="0" w:noVBand="1" w:val="04A0"/>
+      </w:tblPr>
+      <w:tblGrid>
+        <w:gridCol w:w="2160"/>
+        <w:gridCol w:w="2160"/>
+        <w:gridCol w:w="2160"/>
+        <w:gridCol w:w="2160"/>
+      </w:tblGrid>
+      <w:tr>
+        <w:tc>
+          <w:tcPr>
+            <w:tcW w:type="dxa" w:w="1417"/>
+          </w:tcPr>
+          <w:p>
+            <w:r/>
+            <w:r>
+              <w:rPr>
+                <w:b/>
+              </w:rPr>
+              <w:t>Revision</w:t>
+            </w:r>
+          </w:p>
+        </w:tc>
+        <w:tc>
+          <w:tcPr>
+            <w:tcW w:type="dxa" w:w="1701"/>
+          </w:tcPr>
+          <w:p>
+            <w:r/>
+            <w:r>
+              <w:rPr>
+                <w:b/>
+              </w:rPr>
+              <w:t>Date</w:t>
+            </w:r>
+          </w:p>
+        </w:tc>
+        <w:tc>
+          <w:tcPr>
+            <w:tcW w:type="dxa" w:w="1984"/>
+          </w:tcPr>
+          <w:p>
+            <w:r/>
+            <w:r>
+              <w:rPr>
+                <w:b/>
+              </w:rPr>
+              <w:t>Author</w:t>
+            </w:r>
+          </w:p>
+        </w:tc>
+        <w:tc>
+          <w:tcPr>
+            <w:tcW w:type="dxa" w:w="3969"/>
+          </w:tcPr>
+          <w:p>
+            <w:r/>
+            <w:r>
+              <w:rPr>
+                <w:b/>
+              </w:rPr>
+              <w:t>Description of Change</w:t>
+            </w:r>
+          </w:p>
+        </w:tc>
+      </w:tr>
+      <w:tr>
+        <w:tc>
+          <w:tcPr>
+            <w:tcW w:type="dxa" w:w="1417"/>
+          </w:tcPr>
+          <w:p>
+            <w:r/>
+            <w:r>
+              <w:t>__</w:t>
+            </w:r>
+          </w:p>
+        </w:tc>
+        <w:tc>
+          <w:tcPr>
+            <w:tcW w:type="dxa" w:w="1701"/>
+          </w:tcPr>
+          <w:p>
+            <w:r/>
+            <w:r>
+              <w:t>__________</w:t>
+            </w:r>
+          </w:p>
+        </w:tc>
+        <w:tc>
+          <w:tcPr>
+            <w:tcW w:type="dxa" w:w="1984"/>
+          </w:tcPr>
+          <w:p>
+            <w:r/>
+            <w:r>
+              <w:t>__________</w:t>
+            </w:r>
+          </w:p>
+        </w:tc>
+        <w:tc>
+          <w:tcPr>
+            <w:tcW w:type="dxa" w:w="3969"/>
+          </w:tcPr>
+          <w:p>
+            <w:r/>
+            <w:r>
+              <w:t>Initial release</w:t>
+            </w:r>
+          </w:p>
+        </w:tc>
+      </w:tr>
+    </w:tbl>
     <w:p>
       <w:pPr>
         <w:pStyle w:val="Heading1"/>
@@ -58,6 +468,79 @@
       <w:r>
         <w:t>2. PLC Software Architecture</w:t>
       </w:r>
+    </w:p>
+    <w:p>
+      <w:pPr>
+        <w:pStyle w:val="Normal"/>
+      </w:pPr>
+      <w:r>
+        <w:t xml:space="preserve">The E-PU10 V2 controller is implemented as a single TwinCAT 3 PLC project running on a Beckhoff industrial PC. The application is organised in three horizontal layers, supplemented by a separate TwinSAFE safety program:</w:t>
+      </w:r>
+    </w:p>
+    <w:p>
+      <w:pPr>
+        <w:pStyle w:val="ListParagraph"/>
+        <w:numPr>
+          <w:ilvl w:val="0"/>
+          <w:numId w:val="13"/>
+        </w:numPr>
+      </w:pPr>
+      <w:r>
+        <w:t xml:space="preserve">Field I/O layer – EtherCAT terminals (EL/KL series), TwinSAFE coupler, serial communication terminals and field-bus couplers (PROFINET, Modbus).</w:t>
+      </w:r>
+    </w:p>
+    <w:p>
+      <w:pPr>
+        <w:pStyle w:val="ListParagraph"/>
+        <w:numPr>
+          <w:ilvl w:val="0"/>
+          <w:numId w:val="13"/>
+        </w:numPr>
+      </w:pPr>
+      <w:r>
+        <w:t xml:space="preserve">Object layer – one function block (FB_*) per physical or logical device (BMS, PowerStack, CoolingSystem, switchgear, protections, …). Each object FB wraps its own I/O sub-FB and exposes a uniform get / set / params / events interface.</w:t>
+      </w:r>
+    </w:p>
+    <w:p>
+      <w:pPr>
+        <w:pStyle w:val="ListParagraph"/>
+        <w:numPr>
+          <w:ilvl w:val="0"/>
+          <w:numId w:val="13"/>
+        </w:numPr>
+      </w:pPr>
+      <w:r>
+        <w:t xml:space="preserve">System / Control layer – PowerControl and GenGridControl implement the closed-loop power, contactor and grid/genset logic; ErrorHandling, EventLogger, Datalogger and WearLogging provide common cross-cutting services.</w:t>
+      </w:r>
+    </w:p>
+    <w:p>
+      <w:pPr>
+        <w:pStyle w:val="ListParagraph"/>
+        <w:numPr>
+          <w:ilvl w:val="0"/>
+          <w:numId w:val="13"/>
+        </w:numPr>
+      </w:pPr>
+      <w:r>
+        <w:t xml:space="preserve">Supervisory layer – ControlManager coordinates the HMI, IoT (MQTT) and PROFINET external-controller interfaces and selects the active control source.</w:t>
+      </w:r>
+    </w:p>
+    <w:p>
+      <w:pPr>
+        <w:pStyle w:val="ListParagraph"/>
+        <w:numPr>
+          <w:ilvl w:val="0"/>
+          <w:numId w:val="13"/>
+        </w:numPr>
+      </w:pPr>
+      <w:r>
+        <w:t xml:space="preserve">Safety – the TwinSAFE Safety program runs on a dedicated safety runtime, independent of the standard PLC tasks.</w:t>
+      </w:r>
+    </w:p>
+    <w:p>
+      <w:pPr>
+        <w:pStyle w:val="Normal"/>
+      </w:pPr>
     </w:p>
     <w:p>
       <w:r>
@@ -388,19 +871,12 @@
         </w:numPr>
       </w:pPr>
       <w:proofErr w:type="spellStart"/>
-      <w:r>
-        <w:lastRenderedPageBreak/>
-        <w:t>GenComm</w:t>
-      </w:r>
       <w:proofErr w:type="spellEnd"/>
-      <w:r>
-        <w:br/>
-      </w:r>
       <w:proofErr w:type="spellStart"/>
-      <w:r>
-        <w:t>HartingIO</w:t>
-      </w:r>
       <w:proofErr w:type="spellEnd"/>
+      <w:r>
+        <w:t xml:space="preserve">GenComm</w:t>
+      </w:r>
     </w:p>
     <w:p>
       <w:pPr>
@@ -411,10 +887,12 @@
         </w:numPr>
       </w:pPr>
       <w:proofErr w:type="spellStart"/>
-      <w:r>
-        <w:t>InterMachineCom</w:t>
-      </w:r>
       <w:proofErr w:type="spellEnd"/>
+      <w:proofErr w:type="spellStart"/>
+      <w:proofErr w:type="spellEnd"/>
+      <w:r>
+        <w:t xml:space="preserve">HartingIO</w:t>
+      </w:r>
     </w:p>
     <w:p>
       <w:pPr>
@@ -426,7 +904,7 @@
       </w:pPr>
       <w:proofErr w:type="spellStart"/>
       <w:r>
-        <w:t>InternalPowerSupply</w:t>
+        <w:t>InterMachineCom</w:t>
       </w:r>
       <w:proofErr w:type="spellEnd"/>
     </w:p>
@@ -440,7 +918,7 @@
       </w:pPr>
       <w:proofErr w:type="spellStart"/>
       <w:r>
-        <w:t>NeutralTransformer</w:t>
+        <w:t>InternalPowerSupply</w:t>
       </w:r>
       <w:proofErr w:type="spellEnd"/>
     </w:p>
@@ -454,7 +932,7 @@
       </w:pPr>
       <w:proofErr w:type="spellStart"/>
       <w:r>
-        <w:t>PeakshaveBox</w:t>
+        <w:t>NeutralTransformer</w:t>
       </w:r>
       <w:proofErr w:type="spellEnd"/>
     </w:p>
@@ -468,7 +946,7 @@
       </w:pPr>
       <w:proofErr w:type="spellStart"/>
       <w:r>
-        <w:t>PLCStatus</w:t>
+        <w:t>PeakshaveBox</w:t>
       </w:r>
       <w:proofErr w:type="spellEnd"/>
     </w:p>
@@ -482,7 +960,7 @@
       </w:pPr>
       <w:proofErr w:type="spellStart"/>
       <w:r>
-        <w:t>PowerQualityMonitor</w:t>
+        <w:t>PLCStatus</w:t>
       </w:r>
       <w:proofErr w:type="spellEnd"/>
     </w:p>
@@ -496,7 +974,7 @@
       </w:pPr>
       <w:proofErr w:type="spellStart"/>
       <w:r>
-        <w:t>PowerStack</w:t>
+        <w:t>PowerQualityMonitor</w:t>
       </w:r>
       <w:proofErr w:type="spellEnd"/>
     </w:p>
@@ -510,7 +988,7 @@
       </w:pPr>
       <w:proofErr w:type="spellStart"/>
       <w:r>
-        <w:t>ProtectionSystems</w:t>
+        <w:t>PowerStack</w:t>
       </w:r>
       <w:proofErr w:type="spellEnd"/>
     </w:p>
@@ -524,6 +1002,20 @@
       </w:pPr>
       <w:proofErr w:type="spellStart"/>
       <w:r>
+        <w:t>ProtectionSystems</w:t>
+      </w:r>
+      <w:proofErr w:type="spellEnd"/>
+    </w:p>
+    <w:p>
+      <w:pPr>
+        <w:pStyle w:val="ListParagraph"/>
+        <w:numPr>
+          <w:ilvl w:val="2"/>
+          <w:numId w:val="12"/>
+        </w:numPr>
+      </w:pPr>
+      <w:proofErr w:type="spellStart"/>
+      <w:r>
         <w:t>WearLogging</w:t>
       </w:r>
       <w:proofErr w:type="spellEnd"/>
@@ -1948,6 +2440,22 @@
         <w:t xml:space="preserve">Safety Task – runs the TwinSAFE Safety program on a dedicated safety runtime, independently of the standard PLC tasks.</w:t>
       </w:r>
     </w:p>
+    <w:p>
+      <w:pPr>
+        <w:pStyle w:val="Heading2"/>
+      </w:pPr>
+      <w:r>
+        <w:t xml:space="preserve">Data Exchange between Tasks</w:t>
+      </w:r>
+    </w:p>
+    <w:p>
+      <w:pPr>
+        <w:pStyle w:val="Normal"/>
+      </w:pPr>
+      <w:r>
+        <w:t xml:space="preserve">MAIN_Fast owns the master copy of the monitoring data in the structure ST_System_Monitor and exposes a REFERENCE to the control structure ST_System_Control held by MAIN_Slow. After the first slow-task cycle the references between the two tasks are bound, the global flag GVL.b_initCycle is cleared, and all subsequent data exchange is performed by direct structure access without copy-overhead. ControlManager updates the control structure based on the selected control source (HMI, PROFINET or IoT); ErrorHandling, Datalogger and EventLogger read from the shared monitor structure only.</w:t>
+      </w:r>
+    </w:p>
     <w:p/>
     <w:p>
       <w:pPr>
@@ -1959,28 +2467,408 @@
     </w:p>
     <w:p>
       <w:r>
-        <w:t xml:space="preserve">The system state is represented by the eSystemState enumeration with the following values: Off, Shutdown, StandBy, Conditioning, Starting, Running, Charging_Only, Discharging_Only, Stopped, EMstop, Reset, Init, Transport and Dehumidifying.</w:t>
-      </w:r>
-      <w:r>
-        <w:br/>
-      </w:r>
-      <w:r>
-        <w:br/>
-        <w:t xml:space="preserve">Operation mode is selected via the eOperationMode enumeration (Auto, Gridfollowing, GridForming). The active Power-Stack modes are described by ePowerModes (DroopZeroStart, Droop, Isochronous) and eInverterModes (AFE, Island, Microgrid).</w:t>
-      </w:r>
-      <w:r>
-        <w:br/>
-      </w:r>
-      <w:r>
-        <w:br/>
-        <w:t xml:space="preserve">State transitions are driven by ControlManager (operator and remote commands), GenGridControl (automatic start/stop on SOC, load and bus availability) and the Safety program (emergency-stop and critical-fault paths).</w:t>
-      </w:r>
-      <w:r>
-        <w:br/>
-      </w:r>
-      <w:r>
-        <w:br/>
-        <w:t xml:space="preserve">Add state-transition diagram in Appendix B.</w:t>
+        <w:t xml:space="preserve">The supervisory state of the system is captured by the eSystemState enumeration. The states and their meaning are summarised below.</w:t>
+      </w:r>
+    </w:p>
+    <w:tbl>
+      <w:tblPr>
+        <w:tblStyle w:val="TableGrid"/>
+        <w:tblW w:type="auto" w:w="0"/>
+        <w:tblLook w:firstColumn="1" w:firstRow="1" w:lastColumn="0" w:lastRow="0" w:noHBand="0" w:noVBand="1" w:val="04A0"/>
+      </w:tblPr>
+      <w:tblGrid>
+        <w:gridCol w:w="4320"/>
+        <w:gridCol w:w="4320"/>
+      </w:tblGrid>
+      <w:tr>
+        <w:tc>
+          <w:tcPr>
+            <w:tcW w:type="dxa" w:w="2268"/>
+          </w:tcPr>
+          <w:p>
+            <w:r/>
+            <w:r>
+              <w:rPr>
+                <w:b/>
+              </w:rPr>
+              <w:t>State</w:t>
+            </w:r>
+          </w:p>
+        </w:tc>
+        <w:tc>
+          <w:tcPr>
+            <w:tcW w:type="dxa" w:w="6803"/>
+          </w:tcPr>
+          <w:p>
+            <w:r/>
+            <w:r>
+              <w:rPr>
+                <w:b/>
+              </w:rPr>
+              <w:t>Description</w:t>
+            </w:r>
+          </w:p>
+        </w:tc>
+      </w:tr>
+      <w:tr>
+        <w:tc>
+          <w:tcPr>
+            <w:tcW w:type="dxa" w:w="2268"/>
+          </w:tcPr>
+          <w:p>
+            <w:r/>
+            <w:r>
+              <w:t>Init</w:t>
+            </w:r>
+          </w:p>
+        </w:tc>
+        <w:tc>
+          <w:tcPr>
+            <w:tcW w:type="dxa" w:w="6803"/>
+          </w:tcPr>
+          <w:p>
+            <w:r/>
+            <w:r>
+              <w:t>First-cycle initialisation of references and persistent data.</w:t>
+            </w:r>
+          </w:p>
+        </w:tc>
+      </w:tr>
+      <w:tr>
+        <w:tc>
+          <w:tcPr>
+            <w:tcW w:type="dxa" w:w="2268"/>
+          </w:tcPr>
+          <w:p>
+            <w:r/>
+            <w:r>
+              <w:t>Off</w:t>
+            </w:r>
+          </w:p>
+        </w:tc>
+        <w:tc>
+          <w:tcPr>
+            <w:tcW w:type="dxa" w:w="6803"/>
+          </w:tcPr>
+          <w:p>
+            <w:r/>
+            <w:r>
+              <w:t>Application idle, no closed-loop control active.</w:t>
+            </w:r>
+          </w:p>
+        </w:tc>
+      </w:tr>
+      <w:tr>
+        <w:tc>
+          <w:tcPr>
+            <w:tcW w:type="dxa" w:w="2268"/>
+          </w:tcPr>
+          <w:p>
+            <w:r/>
+            <w:r>
+              <w:t>StandBy</w:t>
+            </w:r>
+          </w:p>
+        </w:tc>
+        <w:tc>
+          <w:tcPr>
+            <w:tcW w:type="dxa" w:w="6803"/>
+          </w:tcPr>
+          <w:p>
+            <w:r/>
+            <w:r>
+              <w:t>System energised, no power exchange; awaiting operator or remote command.</w:t>
+            </w:r>
+          </w:p>
+        </w:tc>
+      </w:tr>
+      <w:tr>
+        <w:tc>
+          <w:tcPr>
+            <w:tcW w:type="dxa" w:w="2268"/>
+          </w:tcPr>
+          <w:p>
+            <w:r/>
+            <w:r>
+              <w:t>Conditioning</w:t>
+            </w:r>
+          </w:p>
+        </w:tc>
+        <w:tc>
+          <w:tcPr>
+            <w:tcW w:type="dxa" w:w="6803"/>
+          </w:tcPr>
+          <w:p>
+            <w:r/>
+            <w:r>
+              <w:t>Pre-charge and contactor sequencing prior to going to Running.</w:t>
+            </w:r>
+          </w:p>
+        </w:tc>
+      </w:tr>
+      <w:tr>
+        <w:tc>
+          <w:tcPr>
+            <w:tcW w:type="dxa" w:w="2268"/>
+          </w:tcPr>
+          <w:p>
+            <w:r/>
+            <w:r>
+              <w:t>Starting</w:t>
+            </w:r>
+          </w:p>
+        </w:tc>
+        <w:tc>
+          <w:tcPr>
+            <w:tcW w:type="dxa" w:w="6803"/>
+          </w:tcPr>
+          <w:p>
+            <w:r/>
+            <w:r>
+              <w:t>Synchronisation and ramp-up of inverter and contactors.</w:t>
+            </w:r>
+          </w:p>
+        </w:tc>
+      </w:tr>
+      <w:tr>
+        <w:tc>
+          <w:tcPr>
+            <w:tcW w:type="dxa" w:w="2268"/>
+          </w:tcPr>
+          <w:p>
+            <w:r/>
+            <w:r>
+              <w:t>Running</w:t>
+            </w:r>
+          </w:p>
+        </w:tc>
+        <w:tc>
+          <w:tcPr>
+            <w:tcW w:type="dxa" w:w="6803"/>
+          </w:tcPr>
+          <w:p>
+            <w:r/>
+            <w:r>
+              <w:t>Normal closed-loop operation (charge / discharge or grid-forming).</w:t>
+            </w:r>
+          </w:p>
+        </w:tc>
+      </w:tr>
+      <w:tr>
+        <w:tc>
+          <w:tcPr>
+            <w:tcW w:type="dxa" w:w="2268"/>
+          </w:tcPr>
+          <w:p>
+            <w:r/>
+            <w:r>
+              <w:t>Charging_Only</w:t>
+            </w:r>
+          </w:p>
+        </w:tc>
+        <w:tc>
+          <w:tcPr>
+            <w:tcW w:type="dxa" w:w="6803"/>
+          </w:tcPr>
+          <w:p>
+            <w:r/>
+            <w:r>
+              <w:t>Operation restricted to battery charging.</w:t>
+            </w:r>
+          </w:p>
+        </w:tc>
+      </w:tr>
+      <w:tr>
+        <w:tc>
+          <w:tcPr>
+            <w:tcW w:type="dxa" w:w="2268"/>
+          </w:tcPr>
+          <w:p>
+            <w:r/>
+            <w:r>
+              <w:t>Discharging_Only</w:t>
+            </w:r>
+          </w:p>
+        </w:tc>
+        <w:tc>
+          <w:tcPr>
+            <w:tcW w:type="dxa" w:w="6803"/>
+          </w:tcPr>
+          <w:p>
+            <w:r/>
+            <w:r>
+              <w:t>Operation restricted to battery discharging.</w:t>
+            </w:r>
+          </w:p>
+        </w:tc>
+      </w:tr>
+      <w:tr>
+        <w:tc>
+          <w:tcPr>
+            <w:tcW w:type="dxa" w:w="2268"/>
+          </w:tcPr>
+          <w:p>
+            <w:r/>
+            <w:r>
+              <w:t>Stopped</w:t>
+            </w:r>
+          </w:p>
+        </w:tc>
+        <w:tc>
+          <w:tcPr>
+            <w:tcW w:type="dxa" w:w="6803"/>
+          </w:tcPr>
+          <w:p>
+            <w:r/>
+            <w:r>
+              <w:t>Controlled stop completed; ready for restart.</w:t>
+            </w:r>
+          </w:p>
+        </w:tc>
+      </w:tr>
+      <w:tr>
+        <w:tc>
+          <w:tcPr>
+            <w:tcW w:type="dxa" w:w="2268"/>
+          </w:tcPr>
+          <w:p>
+            <w:r/>
+            <w:r>
+              <w:t>Shutdown</w:t>
+            </w:r>
+          </w:p>
+        </w:tc>
+        <w:tc>
+          <w:tcPr>
+            <w:tcW w:type="dxa" w:w="6803"/>
+          </w:tcPr>
+          <w:p>
+            <w:r/>
+            <w:r>
+              <w:t>Controlled shutdown sequence in progress.</w:t>
+            </w:r>
+          </w:p>
+        </w:tc>
+      </w:tr>
+      <w:tr>
+        <w:tc>
+          <w:tcPr>
+            <w:tcW w:type="dxa" w:w="2268"/>
+          </w:tcPr>
+          <w:p>
+            <w:r/>
+            <w:r>
+              <w:t>EMstop</w:t>
+            </w:r>
+          </w:p>
+        </w:tc>
+        <w:tc>
+          <w:tcPr>
+            <w:tcW w:type="dxa" w:w="6803"/>
+          </w:tcPr>
+          <w:p>
+            <w:r/>
+            <w:r>
+              <w:t>Emergency stop active (commanded by the Safety program).</w:t>
+            </w:r>
+          </w:p>
+        </w:tc>
+      </w:tr>
+      <w:tr>
+        <w:tc>
+          <w:tcPr>
+            <w:tcW w:type="dxa" w:w="2268"/>
+          </w:tcPr>
+          <w:p>
+            <w:r/>
+            <w:r>
+              <w:t>Reset</w:t>
+            </w:r>
+          </w:p>
+        </w:tc>
+        <w:tc>
+          <w:tcPr>
+            <w:tcW w:type="dxa" w:w="6803"/>
+          </w:tcPr>
+          <w:p>
+            <w:r/>
+            <w:r>
+              <w:t>Fault reset sequence in progress.</w:t>
+            </w:r>
+          </w:p>
+        </w:tc>
+      </w:tr>
+      <w:tr>
+        <w:tc>
+          <w:tcPr>
+            <w:tcW w:type="dxa" w:w="2268"/>
+          </w:tcPr>
+          <w:p>
+            <w:r/>
+            <w:r>
+              <w:t>Transport</w:t>
+            </w:r>
+          </w:p>
+        </w:tc>
+        <w:tc>
+          <w:tcPr>
+            <w:tcW w:type="dxa" w:w="6803"/>
+          </w:tcPr>
+          <w:p>
+            <w:r/>
+            <w:r>
+              <w:t>Transport mode active – power electronics disabled.</w:t>
+            </w:r>
+          </w:p>
+        </w:tc>
+      </w:tr>
+      <w:tr>
+        <w:tc>
+          <w:tcPr>
+            <w:tcW w:type="dxa" w:w="2268"/>
+          </w:tcPr>
+          <w:p>
+            <w:r/>
+            <w:r>
+              <w:t>Dehumidifying</w:t>
+            </w:r>
+          </w:p>
+        </w:tc>
+        <w:tc>
+          <w:tcPr>
+            <w:tcW w:type="dxa" w:w="6803"/>
+          </w:tcPr>
+          <w:p>
+            <w:r/>
+            <w:r>
+              <w:t>Climate-control-driven dehumidification cycle of the cabinet.</w:t>
+            </w:r>
+          </w:p>
+        </w:tc>
+      </w:tr>
+    </w:tbl>
+    <w:p>
+      <w:pPr>
+        <w:pStyle w:val="Normal"/>
+      </w:pPr>
+      <w:r>
+        <w:t xml:space="preserve">Operation mode is selected via the eOperationMode enumeration (Auto, Gridfollowing, GridForming).</w:t>
+      </w:r>
+    </w:p>
+    <w:p>
+      <w:pPr>
+        <w:pStyle w:val="Normal"/>
+      </w:pPr>
+      <w:r>
+        <w:t xml:space="preserve">The active Power-Stack modes are described by ePowerModes (DroopZeroStart, Droop, Isochronous) and eInverterModes (AFE, Island, Microgrid).</w:t>
+      </w:r>
+    </w:p>
+    <w:p>
+      <w:pPr>
+        <w:pStyle w:val="Normal"/>
+      </w:pPr>
+      <w:r>
+        <w:t xml:space="preserve">State transitions are driven by ControlManager (operator and remote commands), GenGridControl (automatic start/stop on SOC, load and bus availability) and the Safety program (emergency-stop and critical-fault paths). The state transition diagram is provided in Appendix B.</w:t>
       </w:r>
     </w:p>
     <w:p>
@@ -1988,103 +2876,124 @@
         <w:pStyle w:val="Heading1"/>
       </w:pPr>
       <w:r>
-        <w:t>6. Object-Level Design</w:t>
-      </w:r>
-    </w:p>
-    <w:p>
-      <w:r>
-        <w:t xml:space="preserve">BMS:</w:t>
-      </w:r>
-      <w:r>
-        <w:br/>
-        <w:t xml:space="preserve">- SOC, SOH, system voltage, current and temperature monitoring</w:t>
-      </w:r>
-      <w:r>
-        <w:br/>
-        <w:t xml:space="preserve">- Battery warnings and faults derived from MBMU / SBMU status words</w:t>
-      </w:r>
-      <w:r>
-        <w:br/>
-        <w:t xml:space="preserve">- Persistent cycle counter and lifetime energy / min-max statistics</w:t>
-      </w:r>
-      <w:r>
-        <w:br/>
-      </w:r>
-      <w:r>
-        <w:br/>
-        <w:t xml:space="preserve">PowerStack:</w:t>
-      </w:r>
-      <w:r>
-        <w:br/>
-        <w:t xml:space="preserve">- Active and reactive power requests forwarded to the inverter</w:t>
-      </w:r>
-      <w:r>
-        <w:br/>
-        <w:t xml:space="preserve">- Net contactor, master / slave MCCB and AC-rotation switch control with EDM feedbacks</w:t>
-      </w:r>
-      <w:r>
-        <w:br/>
-        <w:t xml:space="preserve">- Inverter and power-mode state machines (AFE / Island / Microgrid; Droop / Isochronous)</w:t>
-      </w:r>
-      <w:r>
-        <w:br/>
-      </w:r>
-      <w:r>
-        <w:br/>
-        <w:t xml:space="preserve">CoolingSystem:</w:t>
-      </w:r>
-      <w:r>
-        <w:br/>
-        <w:t xml:space="preserve">- Cabinet and power-electronics thermal management</w:t>
-      </w:r>
-      <w:r>
-        <w:br/>
-        <w:t xml:space="preserve">- Fan and heat-pump (Trane / LG) control with multi-level power requests</w:t>
-      </w:r>
-      <w:r>
-        <w:br/>
-      </w:r>
-      <w:r>
-        <w:br/>
-        <w:t xml:space="preserve">ProtectionSystems:</w:t>
-      </w:r>
-      <w:r>
-        <w:br/>
-        <w:t xml:space="preserve">- Insulation monitoring, residual-current monitoring, overcurrent and surge protection, fire detection</w:t>
-      </w:r>
-      <w:r>
-        <w:br/>
-        <w:t xml:space="preserve">- Trip aggregation into the global shutdown logic</w:t>
-      </w:r>
-      <w:r>
-        <w:br/>
-      </w:r>
-      <w:r>
-        <w:br/>
-        <w:t xml:space="preserve">PowerQualityMonitor:</w:t>
-      </w:r>
-      <w:r>
-        <w:br/>
-        <w:t xml:space="preserve">- Janitza UMG 801 measurements and energy counters</w:t>
-      </w:r>
-      <w:r>
-        <w:br/>
-        <w:t xml:space="preserve">- Current-unbalance and grid-code violation detection</w:t>
-      </w:r>
-      <w:r>
-        <w:br/>
-      </w:r>
-      <w:r>
-        <w:br/>
-        <w:t xml:space="preserve">Safety:</w:t>
-      </w:r>
-      <w:r>
-        <w:br/>
-        <w:t xml:space="preserve">- TwinSAFE program with E-Stop, EDM monitoring and safe-state transition</w:t>
-      </w:r>
-      <w:r>
-        <w:br/>
-        <w:t xml:space="preserve">- Interface structures ST_Safety_ContactorEDM, ST_Safety_ToSafetyPrg, ST_Safety_get</w:t>
+        <w:t xml:space="preserve">6. Cross-Cutting Design Concerns</w:t>
+      </w:r>
+    </w:p>
+    <w:p>
+      <w:r>
+        <w:t xml:space="preserve">This section describes design concerns that span several modules and that the maintainer needs to keep in mind when extending the application.</w:t>
+      </w:r>
+    </w:p>
+    <w:p>
+      <w:pPr>
+        <w:pStyle w:val="Heading2"/>
+      </w:pPr>
+      <w:r>
+        <w:t xml:space="preserve">Shared monitoring and control structures</w:t>
+      </w:r>
+    </w:p>
+    <w:p>
+      <w:pPr>
+        <w:pStyle w:val="Normal"/>
+      </w:pPr>
+      <w:r>
+        <w:t xml:space="preserve">All inter-module data exchange uses two top-level structures: ST_System_Monitor (read-only image of the application state, owned by the fast task) and ST_System_Control (operator and remote commands, owned by the slow task). New object FBs must publish their data through these structures rather than via direct cross-references.</w:t>
+      </w:r>
+    </w:p>
+    <w:p>
+      <w:pPr>
+        <w:pStyle w:val="Heading2"/>
+      </w:pPr>
+      <w:r>
+        <w:t xml:space="preserve">Persistent data and settings management</w:t>
+      </w:r>
+    </w:p>
+    <w:p>
+      <w:pPr>
+        <w:pStyle w:val="Normal"/>
+      </w:pPr>
+      <w:r>
+        <w:t xml:space="preserve">Configuration, machine parameters, grid-code parameters, properties and calibration data are kept in PERSISTENT global variables in the Settings GVL. The ControlManager triggers an explicit write-back via the TwinCAT WritePersistentData function block when the operator activates new settings on the HMI. Object FBs that need their own lifetime counters (BMS cycle count and energy, Power-Quality Monitor energies, wear loggers) declare their own VAR PERSISTENT block.</w:t>
+      </w:r>
+    </w:p>
+    <w:p>
+      <w:pPr>
+        <w:pStyle w:val="Heading2"/>
+      </w:pPr>
+      <w:r>
+        <w:t xml:space="preserve">Initialisation cycle</w:t>
+      </w:r>
+    </w:p>
+    <w:p>
+      <w:pPr>
+        <w:pStyle w:val="Normal"/>
+      </w:pPr>
+      <w:r>
+        <w:t xml:space="preserve">The first cycle of each run is signalled by the global flag GVL.b_initCycle, which is cleared by MAIN_Slow at the end of its first execution. Object FBs use this flag to perform reference binding, persistent-data initialisation and one-shot configuration without introducing init-only state machines.</w:t>
+      </w:r>
+    </w:p>
+    <w:p>
+      <w:pPr>
+        <w:pStyle w:val="Heading2"/>
+      </w:pPr>
+      <w:r>
+        <w:t xml:space="preserve">Error, event and alarm flow</w:t>
+      </w:r>
+    </w:p>
+    <w:p>
+      <w:pPr>
+        <w:pStyle w:val="Normal"/>
+      </w:pPr>
+      <w:r>
+        <w:t xml:space="preserve">Faults raised anywhere in the application are pushed through a common FB_AddErrorST interface into the ErrorHandling program. ErrorHandling classifies entries as Warning, Error or Fault and updates the global warning / shutdown flags consumed by the Power Stack and contactor logic. EventLogger persists state changes and operator actions to file, and the IoT module forwards active events to the remote broker.</w:t>
+      </w:r>
+    </w:p>
+    <w:p>
+      <w:pPr>
+        <w:pStyle w:val="Heading2"/>
+      </w:pPr>
+      <w:r>
+        <w:t xml:space="preserve">Control-source arbitration</w:t>
+      </w:r>
+    </w:p>
+    <w:p>
+      <w:pPr>
+        <w:pStyle w:val="Normal"/>
+      </w:pPr>
+      <w:r>
+        <w:t xml:space="preserve">Three control sources are supported: local HMI, PROFINET external controller and IoT/MQTT. ControlManager.ControlSourceSelector picks one source per cycle based on operator selection and module availability, and writes the resulting setpoints into ST_System_Control. Only the selected source is allowed to change setpoints; the others remain read-only.</w:t>
+      </w:r>
+    </w:p>
+    <w:p>
+      <w:pPr>
+        <w:pStyle w:val="Heading2"/>
+      </w:pPr>
+      <w:r>
+        <w:t xml:space="preserve">Wear and lifetime logging</w:t>
+      </w:r>
+    </w:p>
+    <w:p>
+      <w:pPr>
+        <w:pStyle w:val="Normal"/>
+      </w:pPr>
+      <w:r>
+        <w:t xml:space="preserve">Long-term statistics (on-time, cycle counts, min/max values) are captured by FB_VarLogger instances belonging to the relevant object FB. Values are stored as VAR PERSISTENT and exposed both on the HMI Historics screen and through the IoT interface.</w:t>
+      </w:r>
+    </w:p>
+    <w:p>
+      <w:pPr>
+        <w:pStyle w:val="Heading2"/>
+      </w:pPr>
+      <w:r>
+        <w:t xml:space="preserve">Diagnostics and PLC status</w:t>
+      </w:r>
+    </w:p>
+    <w:p>
+      <w:pPr>
+        <w:pStyle w:val="Normal"/>
+      </w:pPr>
+      <w:r>
+        <w:t xml:space="preserve">PLCStatus reads the EL9410 supply terminal and reports PLC health, cycle status and persistent-data state. Communication availability of the BMS, Power Stack, PROFINET, IoT and 4G router is surfaced through the corresponding object FBs and aggregated on the HMI Diagnostics screen.</w:t>
       </w:r>
     </w:p>
     <w:p>
@@ -2153,112 +3062,779 @@
     </w:p>
     <w:p>
       <w:r>
-        <w:t xml:space="preserve">Field bus and I/O backbone:</w:t>
-      </w:r>
-      <w:r>
-        <w:br/>
-        <w:t xml:space="preserve">- EtherCAT for all on-board I/O terminals (EL / KL series), the TwinSAFE coupler and the Janitza UMG 801 power-quality meter.</w:t>
-      </w:r>
-      <w:r>
-        <w:br/>
-      </w:r>
-      <w:r>
-        <w:br/>
-        <w:t xml:space="preserve">Battery Management System (BMS):</w:t>
-      </w:r>
-      <w:r>
-        <w:br/>
-        <w:t xml:space="preserve">- MBMU / SBMU status data exchange; CAN-bus communication faults between MBMU and SBMUs are surfaced as warnings/faults inside FB_BMS_IO.</w:t>
-      </w:r>
-      <w:r>
-        <w:br/>
-      </w:r>
-      <w:r>
-        <w:br/>
-        <w:t xml:space="preserve">Power Stack / Power Modules:</w:t>
-      </w:r>
-      <w:r>
-        <w:br/>
-        <w:t xml:space="preserve">- Modbus RTU master via the KL6x22B serial terminal (ModbusRtuMasterV2_KL6x22B).</w:t>
-      </w:r>
-      <w:r>
-        <w:br/>
-      </w:r>
-      <w:r>
-        <w:br/>
-        <w:t xml:space="preserve">Cooling system (heat pump):</w:t>
-      </w:r>
-      <w:r>
-        <w:br/>
-        <w:t xml:space="preserve">- Modbus interface to the selected heat-pump variant (Trane / LG).</w:t>
-      </w:r>
-      <w:r>
-        <w:br/>
-      </w:r>
-      <w:r>
-        <w:br/>
-        <w:t xml:space="preserve">External / SCADA controller:</w:t>
-      </w:r>
-      <w:r>
-        <w:br/>
-        <w:t xml:space="preserve">- PROFINET coupler (Beckhoff EL669x) handled by FB_ExternalController; active only when configured.</w:t>
-      </w:r>
-      <w:r>
-        <w:br/>
-      </w:r>
-      <w:r>
-        <w:br/>
-        <w:t xml:space="preserve">Remote telemetry and control:</w:t>
-      </w:r>
-      <w:r>
-        <w:br/>
-        <w:t xml:space="preserve">- MQTT over TLS to the OpenRemote broker (FB_IotMqttClient).</w:t>
-      </w:r>
-      <w:r>
-        <w:br/>
-        <w:t xml:space="preserve">- Inter-machine communication between parallel units also uses MQTT.</w:t>
-      </w:r>
-      <w:r>
-        <w:br/>
-      </w:r>
-      <w:r>
-        <w:br/>
-        <w:t xml:space="preserve">Genset:</w:t>
-      </w:r>
-      <w:r>
-        <w:br/>
-        <w:t xml:space="preserve">- DEIF AGC-150 controller interface (FB_AGC150) for monitoring and load-share.</w:t>
-      </w:r>
-      <w:r>
-        <w:br/>
-      </w:r>
-      <w:r>
-        <w:br/>
-        <w:t xml:space="preserve">Connectivity:</w:t>
-      </w:r>
-      <w:r>
-        <w:br/>
-        <w:t xml:space="preserve">- Teltonika 4G router (FB_Teltonika) provides the wide-area transport for the IoT module.</w:t>
-      </w:r>
-      <w:r>
-        <w:br/>
-      </w:r>
-      <w:r>
-        <w:br/>
-        <w:t xml:space="preserve">Customer I/O:</w:t>
-      </w:r>
-      <w:r>
-        <w:br/>
-        <w:t xml:space="preserve">- Harting connector digital I/O (FB_HartingIO) for hard-wired start/stop, status and alarm exchange.</w:t>
-      </w:r>
-      <w:r>
-        <w:br/>
-      </w:r>
-      <w:r>
-        <w:br/>
-        <w:t xml:space="preserve">Detailed register maps and message catalogues are listed in Appendices D and E.</w:t>
-      </w:r>
-    </w:p>
+        <w:t xml:space="preserve">The following table summarises the external communication interfaces implemented in the application. Detailed register maps and message catalogues are provided in Appendices D and E.</w:t>
+      </w:r>
+    </w:p>
+    <w:tbl>
+      <w:tblPr>
+        <w:tblStyle w:val="TableGrid"/>
+        <w:tblW w:type="auto" w:w="0"/>
+        <w:tblLook w:firstColumn="1" w:firstRow="1" w:lastColumn="0" w:lastRow="0" w:noHBand="0" w:noVBand="1" w:val="04A0"/>
+      </w:tblPr>
+      <w:tblGrid>
+        <w:gridCol w:w="1728"/>
+        <w:gridCol w:w="1728"/>
+        <w:gridCol w:w="1728"/>
+        <w:gridCol w:w="1728"/>
+        <w:gridCol w:w="1728"/>
+      </w:tblGrid>
+      <w:tr>
+        <w:tc>
+          <w:tcPr>
+            <w:tcW w:type="dxa" w:w="1984"/>
+          </w:tcPr>
+          <w:p>
+            <w:r/>
+            <w:r>
+              <w:rPr>
+                <w:b/>
+              </w:rPr>
+              <w:t>Interface</w:t>
+            </w:r>
+          </w:p>
+        </w:tc>
+        <w:tc>
+          <w:tcPr>
+            <w:tcW w:type="dxa" w:w="1984"/>
+          </w:tcPr>
+          <w:p>
+            <w:r/>
+            <w:r>
+              <w:rPr>
+                <w:b/>
+              </w:rPr>
+              <w:t>Protocol / Transport</w:t>
+            </w:r>
+          </w:p>
+        </w:tc>
+        <w:tc>
+          <w:tcPr>
+            <w:tcW w:type="dxa" w:w="1134"/>
+          </w:tcPr>
+          <w:p>
+            <w:r/>
+            <w:r>
+              <w:rPr>
+                <w:b/>
+              </w:rPr>
+              <w:t>Direction</w:t>
+            </w:r>
+          </w:p>
+        </w:tc>
+        <w:tc>
+          <w:tcPr>
+            <w:tcW w:type="dxa" w:w="1984"/>
+          </w:tcPr>
+          <w:p>
+            <w:r/>
+            <w:r>
+              <w:rPr>
+                <w:b/>
+              </w:rPr>
+              <w:t>Implementation</w:t>
+            </w:r>
+          </w:p>
+        </w:tc>
+        <w:tc>
+          <w:tcPr>
+            <w:tcW w:type="dxa" w:w="2268"/>
+          </w:tcPr>
+          <w:p>
+            <w:r/>
+            <w:r>
+              <w:rPr>
+                <w:b/>
+              </w:rPr>
+              <w:t>Purpose</w:t>
+            </w:r>
+          </w:p>
+        </w:tc>
+      </w:tr>
+      <w:tr>
+        <w:tc>
+          <w:tcPr>
+            <w:tcW w:type="dxa" w:w="1984"/>
+          </w:tcPr>
+          <w:p>
+            <w:r/>
+            <w:r>
+              <w:t>On-board I/O</w:t>
+            </w:r>
+          </w:p>
+        </w:tc>
+        <w:tc>
+          <w:tcPr>
+            <w:tcW w:type="dxa" w:w="1984"/>
+          </w:tcPr>
+          <w:p>
+            <w:r/>
+            <w:r>
+              <w:t>EtherCAT</w:t>
+            </w:r>
+          </w:p>
+        </w:tc>
+        <w:tc>
+          <w:tcPr>
+            <w:tcW w:type="dxa" w:w="1134"/>
+          </w:tcPr>
+          <w:p>
+            <w:r/>
+            <w:r>
+              <w:t>Master</w:t>
+            </w:r>
+          </w:p>
+        </w:tc>
+        <w:tc>
+          <w:tcPr>
+            <w:tcW w:type="dxa" w:w="1984"/>
+          </w:tcPr>
+          <w:p>
+            <w:r/>
+            <w:r>
+              <w:t>Beckhoff EL/KL terminals</w:t>
+            </w:r>
+          </w:p>
+        </w:tc>
+        <w:tc>
+          <w:tcPr>
+            <w:tcW w:type="dxa" w:w="2268"/>
+          </w:tcPr>
+          <w:p>
+            <w:r/>
+            <w:r>
+              <w:t>Digital and analogue I/O, serial gateways, TwinSAFE coupler.</w:t>
+            </w:r>
+          </w:p>
+        </w:tc>
+      </w:tr>
+      <w:tr>
+        <w:tc>
+          <w:tcPr>
+            <w:tcW w:type="dxa" w:w="1984"/>
+          </w:tcPr>
+          <w:p>
+            <w:r/>
+            <w:r>
+              <w:t>BMS</w:t>
+            </w:r>
+          </w:p>
+        </w:tc>
+        <w:tc>
+          <w:tcPr>
+            <w:tcW w:type="dxa" w:w="1984"/>
+          </w:tcPr>
+          <w:p>
+            <w:r/>
+            <w:r>
+              <w:t>MBMU/SBMU data exchange (CAN-based diagnostics)</w:t>
+            </w:r>
+          </w:p>
+        </w:tc>
+        <w:tc>
+          <w:tcPr>
+            <w:tcW w:type="dxa" w:w="1134"/>
+          </w:tcPr>
+          <w:p>
+            <w:r/>
+            <w:r>
+              <w:t>Master</w:t>
+            </w:r>
+          </w:p>
+        </w:tc>
+        <w:tc>
+          <w:tcPr>
+            <w:tcW w:type="dxa" w:w="1984"/>
+          </w:tcPr>
+          <w:p>
+            <w:r/>
+            <w:r>
+              <w:t>FB_BMS / FB_BMS_IO</w:t>
+            </w:r>
+          </w:p>
+        </w:tc>
+        <w:tc>
+          <w:tcPr>
+            <w:tcW w:type="dxa" w:w="2268"/>
+          </w:tcPr>
+          <w:p>
+            <w:r/>
+            <w:r>
+              <w:t>Battery status, SOC/SOH, faults and HV-DC control.</w:t>
+            </w:r>
+          </w:p>
+        </w:tc>
+      </w:tr>
+      <w:tr>
+        <w:tc>
+          <w:tcPr>
+            <w:tcW w:type="dxa" w:w="1984"/>
+          </w:tcPr>
+          <w:p>
+            <w:r/>
+            <w:r>
+              <w:t>Power modules</w:t>
+            </w:r>
+          </w:p>
+        </w:tc>
+        <w:tc>
+          <w:tcPr>
+            <w:tcW w:type="dxa" w:w="1984"/>
+          </w:tcPr>
+          <w:p>
+            <w:r/>
+            <w:r>
+              <w:t>Modbus RTU</w:t>
+            </w:r>
+          </w:p>
+        </w:tc>
+        <w:tc>
+          <w:tcPr>
+            <w:tcW w:type="dxa" w:w="1134"/>
+          </w:tcPr>
+          <w:p>
+            <w:r/>
+            <w:r>
+              <w:t>Master</w:t>
+            </w:r>
+          </w:p>
+        </w:tc>
+        <w:tc>
+          <w:tcPr>
+            <w:tcW w:type="dxa" w:w="1984"/>
+          </w:tcPr>
+          <w:p>
+            <w:r/>
+            <w:r>
+              <w:t>ModbusRtuMasterV2_KL6x22B in FB_PowerStack</w:t>
+            </w:r>
+          </w:p>
+        </w:tc>
+        <w:tc>
+          <w:tcPr>
+            <w:tcW w:type="dxa" w:w="2268"/>
+          </w:tcPr>
+          <w:p>
+            <w:r/>
+            <w:r>
+              <w:t>Power module command and status exchange.</w:t>
+            </w:r>
+          </w:p>
+        </w:tc>
+      </w:tr>
+      <w:tr>
+        <w:tc>
+          <w:tcPr>
+            <w:tcW w:type="dxa" w:w="1984"/>
+          </w:tcPr>
+          <w:p>
+            <w:r/>
+            <w:r>
+              <w:t>Heat-pump</w:t>
+            </w:r>
+          </w:p>
+        </w:tc>
+        <w:tc>
+          <w:tcPr>
+            <w:tcW w:type="dxa" w:w="1984"/>
+          </w:tcPr>
+          <w:p>
+            <w:r/>
+            <w:r>
+              <w:t>Modbus</w:t>
+            </w:r>
+          </w:p>
+        </w:tc>
+        <w:tc>
+          <w:tcPr>
+            <w:tcW w:type="dxa" w:w="1134"/>
+          </w:tcPr>
+          <w:p>
+            <w:r/>
+            <w:r>
+              <w:t>Master</w:t>
+            </w:r>
+          </w:p>
+        </w:tc>
+        <w:tc>
+          <w:tcPr>
+            <w:tcW w:type="dxa" w:w="1984"/>
+          </w:tcPr>
+          <w:p>
+            <w:r/>
+            <w:r>
+              <w:t>FB_TraneHeatpump / FB_LGHeatpump</w:t>
+            </w:r>
+          </w:p>
+        </w:tc>
+        <w:tc>
+          <w:tcPr>
+            <w:tcW w:type="dxa" w:w="2268"/>
+          </w:tcPr>
+          <w:p>
+            <w:r/>
+            <w:r>
+              <w:t>Cooling system command and status.</w:t>
+            </w:r>
+          </w:p>
+        </w:tc>
+      </w:tr>
+      <w:tr>
+        <w:tc>
+          <w:tcPr>
+            <w:tcW w:type="dxa" w:w="1984"/>
+          </w:tcPr>
+          <w:p>
+            <w:r/>
+            <w:r>
+              <w:t>Power-quality meter</w:t>
+            </w:r>
+          </w:p>
+        </w:tc>
+        <w:tc>
+          <w:tcPr>
+            <w:tcW w:type="dxa" w:w="1984"/>
+          </w:tcPr>
+          <w:p>
+            <w:r/>
+            <w:r>
+              <w:t>EtherCAT</w:t>
+            </w:r>
+          </w:p>
+        </w:tc>
+        <w:tc>
+          <w:tcPr>
+            <w:tcW w:type="dxa" w:w="1134"/>
+          </w:tcPr>
+          <w:p>
+            <w:r/>
+            <w:r>
+              <w:t>Master</w:t>
+            </w:r>
+          </w:p>
+        </w:tc>
+        <w:tc>
+          <w:tcPr>
+            <w:tcW w:type="dxa" w:w="1984"/>
+          </w:tcPr>
+          <w:p>
+            <w:r/>
+            <w:r>
+              <w:t>Janitza UMG 801 via FB_Janitza_UMG801</w:t>
+            </w:r>
+          </w:p>
+        </w:tc>
+        <w:tc>
+          <w:tcPr>
+            <w:tcW w:type="dxa" w:w="2268"/>
+          </w:tcPr>
+          <w:p>
+            <w:r/>
+            <w:r>
+              <w:t>AC measurements, energy counters, grid-code violations.</w:t>
+            </w:r>
+          </w:p>
+        </w:tc>
+      </w:tr>
+      <w:tr>
+        <w:tc>
+          <w:tcPr>
+            <w:tcW w:type="dxa" w:w="1984"/>
+          </w:tcPr>
+          <w:p>
+            <w:r/>
+            <w:r>
+              <w:t>External controller (EMS/SCADA)</w:t>
+            </w:r>
+          </w:p>
+        </w:tc>
+        <w:tc>
+          <w:tcPr>
+            <w:tcW w:type="dxa" w:w="1984"/>
+          </w:tcPr>
+          <w:p>
+            <w:r/>
+            <w:r>
+              <w:t>PROFINET</w:t>
+            </w:r>
+          </w:p>
+        </w:tc>
+        <w:tc>
+          <w:tcPr>
+            <w:tcW w:type="dxa" w:w="1134"/>
+          </w:tcPr>
+          <w:p>
+            <w:r/>
+            <w:r>
+              <w:t>Device/Master</w:t>
+            </w:r>
+          </w:p>
+        </w:tc>
+        <w:tc>
+          <w:tcPr>
+            <w:tcW w:type="dxa" w:w="1984"/>
+          </w:tcPr>
+          <w:p>
+            <w:r/>
+            <w:r>
+              <w:t>Beckhoff EL669x coupler, FB_ExternalController</w:t>
+            </w:r>
+          </w:p>
+        </w:tc>
+        <w:tc>
+          <w:tcPr>
+            <w:tcW w:type="dxa" w:w="2268"/>
+          </w:tcPr>
+          <w:p>
+            <w:r/>
+            <w:r>
+              <w:t>Setpoint and feedback exchange with upstream controller.</w:t>
+            </w:r>
+          </w:p>
+        </w:tc>
+      </w:tr>
+      <w:tr>
+        <w:tc>
+          <w:tcPr>
+            <w:tcW w:type="dxa" w:w="1984"/>
+          </w:tcPr>
+          <w:p>
+            <w:r/>
+            <w:r>
+              <w:t>Remote telemetry / commands</w:t>
+            </w:r>
+          </w:p>
+        </w:tc>
+        <w:tc>
+          <w:tcPr>
+            <w:tcW w:type="dxa" w:w="1984"/>
+          </w:tcPr>
+          <w:p>
+            <w:r/>
+            <w:r>
+              <w:t>MQTT over TLS</w:t>
+            </w:r>
+          </w:p>
+        </w:tc>
+        <w:tc>
+          <w:tcPr>
+            <w:tcW w:type="dxa" w:w="1134"/>
+          </w:tcPr>
+          <w:p>
+            <w:r/>
+            <w:r>
+              <w:t>Client</w:t>
+            </w:r>
+          </w:p>
+        </w:tc>
+        <w:tc>
+          <w:tcPr>
+            <w:tcW w:type="dxa" w:w="1984"/>
+          </w:tcPr>
+          <w:p>
+            <w:r/>
+            <w:r>
+              <w:t>FB_IotMqttClient / MqttComOpenremote</w:t>
+            </w:r>
+          </w:p>
+        </w:tc>
+        <w:tc>
+          <w:tcPr>
+            <w:tcW w:type="dxa" w:w="2268"/>
+          </w:tcPr>
+          <w:p>
+            <w:r/>
+            <w:r>
+              <w:t>Cloud telemetry, alarm forwarding, remote shutdown.</w:t>
+            </w:r>
+          </w:p>
+        </w:tc>
+      </w:tr>
+      <w:tr>
+        <w:tc>
+          <w:tcPr>
+            <w:tcW w:type="dxa" w:w="1984"/>
+          </w:tcPr>
+          <w:p>
+            <w:r/>
+            <w:r>
+              <w:t>Inter-machine (parallel units)</w:t>
+            </w:r>
+          </w:p>
+        </w:tc>
+        <w:tc>
+          <w:tcPr>
+            <w:tcW w:type="dxa" w:w="1984"/>
+          </w:tcPr>
+          <w:p>
+            <w:r/>
+            <w:r>
+              <w:t>MQTT</w:t>
+            </w:r>
+          </w:p>
+        </w:tc>
+        <w:tc>
+          <w:tcPr>
+            <w:tcW w:type="dxa" w:w="1134"/>
+          </w:tcPr>
+          <w:p>
+            <w:r/>
+            <w:r>
+              <w:t>Client</w:t>
+            </w:r>
+          </w:p>
+        </w:tc>
+        <w:tc>
+          <w:tcPr>
+            <w:tcW w:type="dxa" w:w="1984"/>
+          </w:tcPr>
+          <w:p>
+            <w:r/>
+            <w:r>
+              <w:t>FB_ConnectMqttBroker / FB_InterMachineCommunication</w:t>
+            </w:r>
+          </w:p>
+        </w:tc>
+        <w:tc>
+          <w:tcPr>
+            <w:tcW w:type="dxa" w:w="2268"/>
+          </w:tcPr>
+          <w:p>
+            <w:r/>
+            <w:r>
+              <w:t>Coordination between parallel-operating E-PU10 units.</w:t>
+            </w:r>
+          </w:p>
+        </w:tc>
+      </w:tr>
+      <w:tr>
+        <w:tc>
+          <w:tcPr>
+            <w:tcW w:type="dxa" w:w="1984"/>
+          </w:tcPr>
+          <w:p>
+            <w:r/>
+            <w:r>
+              <w:t>Genset</w:t>
+            </w:r>
+          </w:p>
+        </w:tc>
+        <w:tc>
+          <w:tcPr>
+            <w:tcW w:type="dxa" w:w="1984"/>
+          </w:tcPr>
+          <w:p>
+            <w:r/>
+            <w:r>
+              <w:t>DEIF AGC-150 controller link</w:t>
+            </w:r>
+          </w:p>
+        </w:tc>
+        <w:tc>
+          <w:tcPr>
+            <w:tcW w:type="dxa" w:w="1134"/>
+          </w:tcPr>
+          <w:p>
+            <w:r/>
+            <w:r>
+              <w:t>Master</w:t>
+            </w:r>
+          </w:p>
+        </w:tc>
+        <w:tc>
+          <w:tcPr>
+            <w:tcW w:type="dxa" w:w="1984"/>
+          </w:tcPr>
+          <w:p>
+            <w:r/>
+            <w:r>
+              <w:t>FB_AGC150 / FB_GenComm</w:t>
+            </w:r>
+          </w:p>
+        </w:tc>
+        <w:tc>
+          <w:tcPr>
+            <w:tcW w:type="dxa" w:w="2268"/>
+          </w:tcPr>
+          <w:p>
+            <w:r/>
+            <w:r>
+              <w:t>Generator monitoring, load-share and start/stop.</w:t>
+            </w:r>
+          </w:p>
+        </w:tc>
+      </w:tr>
+      <w:tr>
+        <w:tc>
+          <w:tcPr>
+            <w:tcW w:type="dxa" w:w="1984"/>
+          </w:tcPr>
+          <w:p>
+            <w:r/>
+            <w:r>
+              <w:t>WAN connectivity</w:t>
+            </w:r>
+          </w:p>
+        </w:tc>
+        <w:tc>
+          <w:tcPr>
+            <w:tcW w:type="dxa" w:w="1984"/>
+          </w:tcPr>
+          <w:p>
+            <w:r/>
+            <w:r>
+              <w:t>Cellular (4G)</w:t>
+            </w:r>
+          </w:p>
+        </w:tc>
+        <w:tc>
+          <w:tcPr>
+            <w:tcW w:type="dxa" w:w="1134"/>
+          </w:tcPr>
+          <w:p>
+            <w:r/>
+            <w:r>
+              <w:t>—</w:t>
+            </w:r>
+          </w:p>
+        </w:tc>
+        <w:tc>
+          <w:tcPr>
+            <w:tcW w:type="dxa" w:w="1984"/>
+          </w:tcPr>
+          <w:p>
+            <w:r/>
+            <w:r>
+              <w:t>FB_Teltonika</w:t>
+            </w:r>
+          </w:p>
+        </w:tc>
+        <w:tc>
+          <w:tcPr>
+            <w:tcW w:type="dxa" w:w="2268"/>
+          </w:tcPr>
+          <w:p>
+            <w:r/>
+            <w:r>
+              <w:t>Router supervision; transport layer for the IoT module.</w:t>
+            </w:r>
+          </w:p>
+        </w:tc>
+      </w:tr>
+      <w:tr>
+        <w:tc>
+          <w:tcPr>
+            <w:tcW w:type="dxa" w:w="1984"/>
+          </w:tcPr>
+          <w:p>
+            <w:r/>
+            <w:r>
+              <w:t>Customer I/O</w:t>
+            </w:r>
+          </w:p>
+        </w:tc>
+        <w:tc>
+          <w:tcPr>
+            <w:tcW w:type="dxa" w:w="1984"/>
+          </w:tcPr>
+          <w:p>
+            <w:r/>
+            <w:r>
+              <w:t>Hard-wired digital I/O</w:t>
+            </w:r>
+          </w:p>
+        </w:tc>
+        <w:tc>
+          <w:tcPr>
+            <w:tcW w:type="dxa" w:w="1134"/>
+          </w:tcPr>
+          <w:p>
+            <w:r/>
+            <w:r>
+              <w:t>Bidirectional</w:t>
+            </w:r>
+          </w:p>
+        </w:tc>
+        <w:tc>
+          <w:tcPr>
+            <w:tcW w:type="dxa" w:w="1984"/>
+          </w:tcPr>
+          <w:p>
+            <w:r/>
+            <w:r>
+              <w:t>FB_HartingIO via EtherCAT digital terminals</w:t>
+            </w:r>
+          </w:p>
+        </w:tc>
+        <w:tc>
+          <w:tcPr>
+            <w:tcW w:type="dxa" w:w="2268"/>
+          </w:tcPr>
+          <w:p>
+            <w:r/>
+            <w:r>
+              <w:t>Hard-wired start/stop, status and alarm exchange.</w:t>
+            </w:r>
+          </w:p>
+        </w:tc>
+      </w:tr>
+      <w:tr>
+        <w:tc>
+          <w:tcPr>
+            <w:tcW w:type="dxa" w:w="1984"/>
+          </w:tcPr>
+          <w:p>
+            <w:r/>
+            <w:r>
+              <w:t>Local HMI</w:t>
+            </w:r>
+          </w:p>
+        </w:tc>
+        <w:tc>
+          <w:tcPr>
+            <w:tcW w:type="dxa" w:w="1984"/>
+          </w:tcPr>
+          <w:p>
+            <w:r/>
+            <w:r>
+              <w:t>TwinCAT 3 HMI server (HTTPS / WebSocket)</w:t>
+            </w:r>
+          </w:p>
+        </w:tc>
+        <w:tc>
+          <w:tcPr>
+            <w:tcW w:type="dxa" w:w="1134"/>
+          </w:tcPr>
+          <w:p>
+            <w:r/>
+            <w:r>
+              <w:t>Server</w:t>
+            </w:r>
+          </w:p>
+        </w:tc>
+        <w:tc>
+          <w:tcPr>
+            <w:tcW w:type="dxa" w:w="1984"/>
+          </w:tcPr>
+          <w:p>
+            <w:r/>
+            <w:r>
+              <w:t>TcHmi_ePU10 / HMI program</w:t>
+            </w:r>
+          </w:p>
+        </w:tc>
+        <w:tc>
+          <w:tcPr>
+            <w:tcW w:type="dxa" w:w="2268"/>
+          </w:tcPr>
+          <w:p>
+            <w:r/>
+            <w:r>
+              <w:t>Operator interface on the local panel.</w:t>
+            </w:r>
+          </w:p>
+        </w:tc>
+      </w:tr>
+    </w:tbl>
     <w:p>
       <w:pPr>
         <w:pStyle w:val="Heading1"/>
@@ -2353,38 +3929,31 @@
     </w:p>
     <w:p>
       <w:r>
+        <w:t xml:space="preserve">Appendix A – System Architecture Diagram</w:t>
+      </w:r>
+      <w:r>
         <w:br/>
-        <w:t>Appendix A – System Architecture Diagram</w:t>
+        <w:t xml:space="preserve">Appendix B – State Transition Diagram</w:t>
       </w:r>
       <w:r>
         <w:br/>
-      </w:r>
-      <w:r>
-        <w:lastRenderedPageBreak/>
-        <w:t>Appendix B – State Machine Diagram</w:t>
+        <w:t xml:space="preserve">Appendix C – Alarm and Event Matrix</w:t>
       </w:r>
       <w:r>
         <w:br/>
-        <w:t>Appendix C – Alarm Matrix</w:t>
+        <w:t xml:space="preserve">Appendix D – Modbus Register Maps (Power Stack, Heat Pump)</w:t>
       </w:r>
       <w:r>
         <w:br/>
-        <w:t>Appendix D – Modbus Register Maps</w:t>
+        <w:t xml:space="preserve">Appendix E – BMS Data Exchange Definitions</w:t>
       </w:r>
       <w:r>
         <w:br/>
-        <w:t>Appendix E – CAN Message Definitions</w:t>
+        <w:t xml:space="preserve">Appendix F – HMI Screenshots</w:t>
       </w:r>
       <w:r>
         <w:br/>
-        <w:t>Appendix F – HMI Screenshots</w:t>
-      </w:r>
-      <w:r>
-        <w:br/>
-        <w:t>Appendix G – PLC Task Timing and CPU Load</w:t>
-      </w:r>
-      <w:r>
-        <w:br/>
+        <w:t xml:space="preserve">Appendix G – Acronyms and Glossary</w:t>
       </w:r>
     </w:p>
     <w:sectPr>
@@ -2393,6 +3962,783 @@
       <w:cols w:space="720"/>
       <w:docGrid w:linePitch="360"/>
     </w:sectPr>
+    <w:p>
+      <w:pPr>
+        <w:pStyle w:val="Heading2"/>
+      </w:pPr>
+      <w:r>
+        <w:t xml:space="preserve">Appendix G – Acronyms and Glossary</w:t>
+      </w:r>
+    </w:p>
+    <w:p>
+      <w:pPr>
+        <w:pStyle w:val="Normal"/>
+      </w:pPr>
+      <w:r>
+        <w:t xml:space="preserve">Definitions of acronyms and TwinCAT-specific terms used throughout this document.</w:t>
+      </w:r>
+    </w:p>
+    <w:tbl>
+      <w:tblPr>
+        <w:tblStyle w:val="TableGrid"/>
+        <w:tblW w:type="auto" w:w="0"/>
+        <w:tblLook w:firstColumn="1" w:firstRow="1" w:lastColumn="0" w:lastRow="0" w:noHBand="0" w:noVBand="1" w:val="04A0"/>
+      </w:tblPr>
+      <w:tblGrid>
+        <w:gridCol w:w="4320"/>
+        <w:gridCol w:w="4320"/>
+      </w:tblGrid>
+      <w:tr>
+        <w:tc>
+          <w:tcPr>
+            <w:tcW w:type="dxa" w:w="1701"/>
+          </w:tcPr>
+          <w:p>
+            <w:r/>
+            <w:r>
+              <w:rPr>
+                <w:b/>
+              </w:rPr>
+              <w:t>Term</w:t>
+            </w:r>
+          </w:p>
+        </w:tc>
+        <w:tc>
+          <w:tcPr>
+            <w:tcW w:type="dxa" w:w="7370"/>
+          </w:tcPr>
+          <w:p>
+            <w:r/>
+            <w:r>
+              <w:rPr>
+                <w:b/>
+              </w:rPr>
+              <w:t>Definition</w:t>
+            </w:r>
+          </w:p>
+        </w:tc>
+      </w:tr>
+      <w:tr>
+        <w:tc>
+          <w:tcPr>
+            <w:tcW w:type="dxa" w:w="1701"/>
+          </w:tcPr>
+          <w:p>
+            <w:r/>
+            <w:r>
+              <w:t>AFE</w:t>
+            </w:r>
+          </w:p>
+        </w:tc>
+        <w:tc>
+          <w:tcPr>
+            <w:tcW w:type="dxa" w:w="7370"/>
+          </w:tcPr>
+          <w:p>
+            <w:r/>
+            <w:r>
+              <w:t>Active Front End — grid-tied inverter operation mode.</w:t>
+            </w:r>
+          </w:p>
+        </w:tc>
+      </w:tr>
+      <w:tr>
+        <w:tc>
+          <w:tcPr>
+            <w:tcW w:type="dxa" w:w="1701"/>
+          </w:tcPr>
+          <w:p>
+            <w:r/>
+            <w:r>
+              <w:t>BESS</w:t>
+            </w:r>
+          </w:p>
+        </w:tc>
+        <w:tc>
+          <w:tcPr>
+            <w:tcW w:type="dxa" w:w="7370"/>
+          </w:tcPr>
+          <w:p>
+            <w:r/>
+            <w:r>
+              <w:t>Battery Energy Storage System.</w:t>
+            </w:r>
+          </w:p>
+        </w:tc>
+      </w:tr>
+      <w:tr>
+        <w:tc>
+          <w:tcPr>
+            <w:tcW w:type="dxa" w:w="1701"/>
+          </w:tcPr>
+          <w:p>
+            <w:r/>
+            <w:r>
+              <w:t>BMS</w:t>
+            </w:r>
+          </w:p>
+        </w:tc>
+        <w:tc>
+          <w:tcPr>
+            <w:tcW w:type="dxa" w:w="7370"/>
+          </w:tcPr>
+          <w:p>
+            <w:r/>
+            <w:r>
+              <w:t>Battery Management System.</w:t>
+            </w:r>
+          </w:p>
+        </w:tc>
+      </w:tr>
+      <w:tr>
+        <w:tc>
+          <w:tcPr>
+            <w:tcW w:type="dxa" w:w="1701"/>
+          </w:tcPr>
+          <w:p>
+            <w:r/>
+            <w:r>
+              <w:t>CAN</w:t>
+            </w:r>
+          </w:p>
+        </w:tc>
+        <w:tc>
+          <w:tcPr>
+            <w:tcW w:type="dxa" w:w="7370"/>
+          </w:tcPr>
+          <w:p>
+            <w:r/>
+            <w:r>
+              <w:t>Controller Area Network — used between MBMU and SBMUs.</w:t>
+            </w:r>
+          </w:p>
+        </w:tc>
+      </w:tr>
+      <w:tr>
+        <w:tc>
+          <w:tcPr>
+            <w:tcW w:type="dxa" w:w="1701"/>
+          </w:tcPr>
+          <w:p>
+            <w:r/>
+            <w:r>
+              <w:t>EDM</w:t>
+            </w:r>
+          </w:p>
+        </w:tc>
+        <w:tc>
+          <w:tcPr>
+            <w:tcW w:type="dxa" w:w="7370"/>
+          </w:tcPr>
+          <w:p>
+            <w:r/>
+            <w:r>
+              <w:t>External Device Monitoring — feedback signal of a contactor used by the safety program.</w:t>
+            </w:r>
+          </w:p>
+        </w:tc>
+      </w:tr>
+      <w:tr>
+        <w:tc>
+          <w:tcPr>
+            <w:tcW w:type="dxa" w:w="1701"/>
+          </w:tcPr>
+          <w:p>
+            <w:r/>
+            <w:r>
+              <w:t>EMS</w:t>
+            </w:r>
+          </w:p>
+        </w:tc>
+        <w:tc>
+          <w:tcPr>
+            <w:tcW w:type="dxa" w:w="7370"/>
+          </w:tcPr>
+          <w:p>
+            <w:r/>
+            <w:r>
+              <w:t>Energy Management System (upstream supervisory controller).</w:t>
+            </w:r>
+          </w:p>
+        </w:tc>
+      </w:tr>
+      <w:tr>
+        <w:tc>
+          <w:tcPr>
+            <w:tcW w:type="dxa" w:w="1701"/>
+          </w:tcPr>
+          <w:p>
+            <w:r/>
+            <w:r>
+              <w:t>EtherCAT</w:t>
+            </w:r>
+          </w:p>
+        </w:tc>
+        <w:tc>
+          <w:tcPr>
+            <w:tcW w:type="dxa" w:w="7370"/>
+          </w:tcPr>
+          <w:p>
+            <w:r/>
+            <w:r>
+              <w:t>Real-time industrial Ethernet field bus used by Beckhoff terminals.</w:t>
+            </w:r>
+          </w:p>
+        </w:tc>
+      </w:tr>
+      <w:tr>
+        <w:tc>
+          <w:tcPr>
+            <w:tcW w:type="dxa" w:w="1701"/>
+          </w:tcPr>
+          <w:p>
+            <w:r/>
+            <w:r>
+              <w:t>FAT / SAT</w:t>
+            </w:r>
+          </w:p>
+        </w:tc>
+        <w:tc>
+          <w:tcPr>
+            <w:tcW w:type="dxa" w:w="7370"/>
+          </w:tcPr>
+          <w:p>
+            <w:r/>
+            <w:r>
+              <w:t>Factory / Site Acceptance Test.</w:t>
+            </w:r>
+          </w:p>
+        </w:tc>
+      </w:tr>
+      <w:tr>
+        <w:tc>
+          <w:tcPr>
+            <w:tcW w:type="dxa" w:w="1701"/>
+          </w:tcPr>
+          <w:p>
+            <w:r/>
+            <w:r>
+              <w:t>FB</w:t>
+            </w:r>
+          </w:p>
+        </w:tc>
+        <w:tc>
+          <w:tcPr>
+            <w:tcW w:type="dxa" w:w="7370"/>
+          </w:tcPr>
+          <w:p>
+            <w:r/>
+            <w:r>
+              <w:t>Function Block (TwinCAT POU).</w:t>
+            </w:r>
+          </w:p>
+        </w:tc>
+      </w:tr>
+      <w:tr>
+        <w:tc>
+          <w:tcPr>
+            <w:tcW w:type="dxa" w:w="1701"/>
+          </w:tcPr>
+          <w:p>
+            <w:r/>
+            <w:r>
+              <w:t>GVL</w:t>
+            </w:r>
+          </w:p>
+        </w:tc>
+        <w:tc>
+          <w:tcPr>
+            <w:tcW w:type="dxa" w:w="7370"/>
+          </w:tcPr>
+          <w:p>
+            <w:r/>
+            <w:r>
+              <w:t>Global Variable List (TwinCAT).</w:t>
+            </w:r>
+          </w:p>
+        </w:tc>
+      </w:tr>
+      <w:tr>
+        <w:tc>
+          <w:tcPr>
+            <w:tcW w:type="dxa" w:w="1701"/>
+          </w:tcPr>
+          <w:p>
+            <w:r/>
+            <w:r>
+              <w:t>HMI</w:t>
+            </w:r>
+          </w:p>
+        </w:tc>
+        <w:tc>
+          <w:tcPr>
+            <w:tcW w:type="dxa" w:w="7370"/>
+          </w:tcPr>
+          <w:p>
+            <w:r/>
+            <w:r>
+              <w:t>Human-Machine Interface (TwinCAT 3 HMI server in this project).</w:t>
+            </w:r>
+          </w:p>
+        </w:tc>
+      </w:tr>
+      <w:tr>
+        <w:tc>
+          <w:tcPr>
+            <w:tcW w:type="dxa" w:w="1701"/>
+          </w:tcPr>
+          <w:p>
+            <w:r/>
+            <w:r>
+              <w:t>HV-DC</w:t>
+            </w:r>
+          </w:p>
+        </w:tc>
+        <w:tc>
+          <w:tcPr>
+            <w:tcW w:type="dxa" w:w="7370"/>
+          </w:tcPr>
+          <w:p>
+            <w:r/>
+            <w:r>
+              <w:t>High-voltage DC link between battery and inverter.</w:t>
+            </w:r>
+          </w:p>
+        </w:tc>
+      </w:tr>
+      <w:tr>
+        <w:tc>
+          <w:tcPr>
+            <w:tcW w:type="dxa" w:w="1701"/>
+          </w:tcPr>
+          <w:p>
+            <w:r/>
+            <w:r>
+              <w:t>IoT</w:t>
+            </w:r>
+          </w:p>
+        </w:tc>
+        <w:tc>
+          <w:tcPr>
+            <w:tcW w:type="dxa" w:w="7370"/>
+          </w:tcPr>
+          <w:p>
+            <w:r/>
+            <w:r>
+              <w:t>Internet of Things — here, MQTT-based remote telemetry.</w:t>
+            </w:r>
+          </w:p>
+        </w:tc>
+      </w:tr>
+      <w:tr>
+        <w:tc>
+          <w:tcPr>
+            <w:tcW w:type="dxa" w:w="1701"/>
+          </w:tcPr>
+          <w:p>
+            <w:r/>
+            <w:r>
+              <w:t>KPI</w:t>
+            </w:r>
+          </w:p>
+        </w:tc>
+        <w:tc>
+          <w:tcPr>
+            <w:tcW w:type="dxa" w:w="7370"/>
+          </w:tcPr>
+          <w:p>
+            <w:r/>
+            <w:r>
+              <w:t>Key Performance Indicator.</w:t>
+            </w:r>
+          </w:p>
+        </w:tc>
+      </w:tr>
+      <w:tr>
+        <w:tc>
+          <w:tcPr>
+            <w:tcW w:type="dxa" w:w="1701"/>
+          </w:tcPr>
+          <w:p>
+            <w:r/>
+            <w:r>
+              <w:t>MBMU / SBMU</w:t>
+            </w:r>
+          </w:p>
+        </w:tc>
+        <w:tc>
+          <w:tcPr>
+            <w:tcW w:type="dxa" w:w="7370"/>
+          </w:tcPr>
+          <w:p>
+            <w:r/>
+            <w:r>
+              <w:t>Master / Slave Battery Management Unit.</w:t>
+            </w:r>
+          </w:p>
+        </w:tc>
+      </w:tr>
+      <w:tr>
+        <w:tc>
+          <w:tcPr>
+            <w:tcW w:type="dxa" w:w="1701"/>
+          </w:tcPr>
+          <w:p>
+            <w:r/>
+            <w:r>
+              <w:t>MCCB</w:t>
+            </w:r>
+          </w:p>
+        </w:tc>
+        <w:tc>
+          <w:tcPr>
+            <w:tcW w:type="dxa" w:w="7370"/>
+          </w:tcPr>
+          <w:p>
+            <w:r/>
+            <w:r>
+              <w:t>Moulded Case Circuit Breaker.</w:t>
+            </w:r>
+          </w:p>
+        </w:tc>
+      </w:tr>
+      <w:tr>
+        <w:tc>
+          <w:tcPr>
+            <w:tcW w:type="dxa" w:w="1701"/>
+          </w:tcPr>
+          <w:p>
+            <w:r/>
+            <w:r>
+              <w:t>MQTT</w:t>
+            </w:r>
+          </w:p>
+        </w:tc>
+        <w:tc>
+          <w:tcPr>
+            <w:tcW w:type="dxa" w:w="7370"/>
+          </w:tcPr>
+          <w:p>
+            <w:r/>
+            <w:r>
+              <w:t>Lightweight publish/subscribe messaging protocol over TCP/TLS.</w:t>
+            </w:r>
+          </w:p>
+        </w:tc>
+      </w:tr>
+      <w:tr>
+        <w:tc>
+          <w:tcPr>
+            <w:tcW w:type="dxa" w:w="1701"/>
+          </w:tcPr>
+          <w:p>
+            <w:r/>
+            <w:r>
+              <w:t>PCS</w:t>
+            </w:r>
+          </w:p>
+        </w:tc>
+        <w:tc>
+          <w:tcPr>
+            <w:tcW w:type="dxa" w:w="7370"/>
+          </w:tcPr>
+          <w:p>
+            <w:r/>
+            <w:r>
+              <w:t>Power Conversion System (inverter).</w:t>
+            </w:r>
+          </w:p>
+        </w:tc>
+      </w:tr>
+      <w:tr>
+        <w:tc>
+          <w:tcPr>
+            <w:tcW w:type="dxa" w:w="1701"/>
+          </w:tcPr>
+          <w:p>
+            <w:r/>
+            <w:r>
+              <w:t>PLC</w:t>
+            </w:r>
+          </w:p>
+        </w:tc>
+        <w:tc>
+          <w:tcPr>
+            <w:tcW w:type="dxa" w:w="7370"/>
+          </w:tcPr>
+          <w:p>
+            <w:r/>
+            <w:r>
+              <w:t>Programmable Logic Controller.</w:t>
+            </w:r>
+          </w:p>
+        </w:tc>
+      </w:tr>
+      <w:tr>
+        <w:tc>
+          <w:tcPr>
+            <w:tcW w:type="dxa" w:w="1701"/>
+          </w:tcPr>
+          <w:p>
+            <w:r/>
+            <w:r>
+              <w:t>POU</w:t>
+            </w:r>
+          </w:p>
+        </w:tc>
+        <w:tc>
+          <w:tcPr>
+            <w:tcW w:type="dxa" w:w="7370"/>
+          </w:tcPr>
+          <w:p>
+            <w:r/>
+            <w:r>
+              <w:t>Program Organisation Unit (TwinCAT: PROGRAM, FB or FUNCTION).</w:t>
+            </w:r>
+          </w:p>
+        </w:tc>
+      </w:tr>
+      <w:tr>
+        <w:tc>
+          <w:tcPr>
+            <w:tcW w:type="dxa" w:w="1701"/>
+          </w:tcPr>
+          <w:p>
+            <w:r/>
+            <w:r>
+              <w:t>PROFINET</w:t>
+            </w:r>
+          </w:p>
+        </w:tc>
+        <w:tc>
+          <w:tcPr>
+            <w:tcW w:type="dxa" w:w="7370"/>
+          </w:tcPr>
+          <w:p>
+            <w:r/>
+            <w:r>
+              <w:t>Industrial Ethernet protocol used towards an upstream EMS/SCADA.</w:t>
+            </w:r>
+          </w:p>
+        </w:tc>
+      </w:tr>
+      <w:tr>
+        <w:tc>
+          <w:tcPr>
+            <w:tcW w:type="dxa" w:w="1701"/>
+          </w:tcPr>
+          <w:p>
+            <w:r/>
+            <w:r>
+              <w:t>PSB</w:t>
+            </w:r>
+          </w:p>
+        </w:tc>
+        <w:tc>
+          <w:tcPr>
+            <w:tcW w:type="dxa" w:w="7370"/>
+          </w:tcPr>
+          <w:p>
+            <w:r/>
+            <w:r>
+              <w:t>Peak-Shave Box.</w:t>
+            </w:r>
+          </w:p>
+        </w:tc>
+      </w:tr>
+      <w:tr>
+        <w:tc>
+          <w:tcPr>
+            <w:tcW w:type="dxa" w:w="1701"/>
+          </w:tcPr>
+          <w:p>
+            <w:r/>
+            <w:r>
+              <w:t>PSU</w:t>
+            </w:r>
+          </w:p>
+        </w:tc>
+        <w:tc>
+          <w:tcPr>
+            <w:tcW w:type="dxa" w:w="7370"/>
+          </w:tcPr>
+          <w:p>
+            <w:r/>
+            <w:r>
+              <w:t>Power Supply Unit.</w:t>
+            </w:r>
+          </w:p>
+        </w:tc>
+      </w:tr>
+      <w:tr>
+        <w:tc>
+          <w:tcPr>
+            <w:tcW w:type="dxa" w:w="1701"/>
+          </w:tcPr>
+          <w:p>
+            <w:r/>
+            <w:r>
+              <w:t>SCADA</w:t>
+            </w:r>
+          </w:p>
+        </w:tc>
+        <w:tc>
+          <w:tcPr>
+            <w:tcW w:type="dxa" w:w="7370"/>
+          </w:tcPr>
+          <w:p>
+            <w:r/>
+            <w:r>
+              <w:t>Supervisory Control and Data Acquisition system.</w:t>
+            </w:r>
+          </w:p>
+        </w:tc>
+      </w:tr>
+      <w:tr>
+        <w:tc>
+          <w:tcPr>
+            <w:tcW w:type="dxa" w:w="1701"/>
+          </w:tcPr>
+          <w:p>
+            <w:r/>
+            <w:r>
+              <w:t>SOC / SOH</w:t>
+            </w:r>
+          </w:p>
+        </w:tc>
+        <w:tc>
+          <w:tcPr>
+            <w:tcW w:type="dxa" w:w="7370"/>
+          </w:tcPr>
+          <w:p>
+            <w:r/>
+            <w:r>
+              <w:t>State of Charge / State of Health of the battery.</w:t>
+            </w:r>
+          </w:p>
+        </w:tc>
+      </w:tr>
+      <w:tr>
+        <w:tc>
+          <w:tcPr>
+            <w:tcW w:type="dxa" w:w="1701"/>
+          </w:tcPr>
+          <w:p>
+            <w:r/>
+            <w:r>
+              <w:t>TLS</w:t>
+            </w:r>
+          </w:p>
+        </w:tc>
+        <w:tc>
+          <w:tcPr>
+            <w:tcW w:type="dxa" w:w="7370"/>
+          </w:tcPr>
+          <w:p>
+            <w:r/>
+            <w:r>
+              <w:t>Transport Layer Security.</w:t>
+            </w:r>
+          </w:p>
+        </w:tc>
+      </w:tr>
+      <w:tr>
+        <w:tc>
+          <w:tcPr>
+            <w:tcW w:type="dxa" w:w="1701"/>
+          </w:tcPr>
+          <w:p>
+            <w:r/>
+            <w:r>
+              <w:t>TwinSAFE</w:t>
+            </w:r>
+          </w:p>
+        </w:tc>
+        <w:tc>
+          <w:tcPr>
+            <w:tcW w:type="dxa" w:w="7370"/>
+          </w:tcPr>
+          <w:p>
+            <w:r/>
+            <w:r>
+              <w:t>Beckhoff safety system; safety POUs run on a dedicated safety runtime.</w:t>
+            </w:r>
+          </w:p>
+        </w:tc>
+      </w:tr>
+      <w:tr>
+        <w:tc>
+          <w:tcPr>
+            <w:tcW w:type="dxa" w:w="1701"/>
+          </w:tcPr>
+          <w:p>
+            <w:r/>
+            <w:r>
+              <w:t>UPS</w:t>
+            </w:r>
+          </w:p>
+        </w:tc>
+        <w:tc>
+          <w:tcPr>
+            <w:tcW w:type="dxa" w:w="7370"/>
+          </w:tcPr>
+          <w:p>
+            <w:r/>
+            <w:r>
+              <w:t>Uninterruptible Power Supply.</w:t>
+            </w:r>
+          </w:p>
+        </w:tc>
+      </w:tr>
+      <w:tr>
+        <w:tc>
+          <w:tcPr>
+            <w:tcW w:type="dxa" w:w="1701"/>
+          </w:tcPr>
+          <w:p>
+            <w:r/>
+            <w:r>
+              <w:t>V&amp;V</w:t>
+            </w:r>
+          </w:p>
+        </w:tc>
+        <w:tc>
+          <w:tcPr>
+            <w:tcW w:type="dxa" w:w="7370"/>
+          </w:tcPr>
+          <w:p>
+            <w:r/>
+            <w:r>
+              <w:t>Verification and Validation.</w:t>
+            </w:r>
+          </w:p>
+        </w:tc>
+      </w:tr>
+      <w:tr>
+        <w:tc>
+          <w:tcPr>
+            <w:tcW w:type="dxa" w:w="1701"/>
+          </w:tcPr>
+          <w:p>
+            <w:r/>
+            <w:r>
+              <w:t>ZPT</w:t>
+            </w:r>
+          </w:p>
+        </w:tc>
+        <w:tc>
+          <w:tcPr>
+            <w:tcW w:type="dxa" w:w="7370"/>
+          </w:tcPr>
+          <w:p>
+            <w:r/>
+            <w:r>
+              <w:t>Zero-Point (Neutral-earthing) Transformer.</w:t>
+            </w:r>
+          </w:p>
+        </w:tc>
+      </w:tr>
+    </w:tbl>
   </w:body>
 </w:document>
 </file>

</xml_diff>